<commit_message>
Add PDF export for reports (branches, revenue, cost breakdown, shop sales), cost/unit-cost tracking on showroom items and inventory, seed_users password cleanup
</commit_message>
<xml_diff>
--- a/FMS_Operations_Flow_Manual.docx
+++ b/FMS_Operations_Flow_Manual.docx
@@ -46,7 +46,7 @@
           <w:sz w:val="20"/>
           <w:szCs w:val="20"/>
         </w:rPr>
-        <w:t xml:space="preserve">Contract: SMS-FMS-2026-001  |  Version 1.4  |  July 2026</w:t>
+        <w:t xml:space="preserve">Contract: SMS-FMS-2026-001  |  Version 1.5  |  July 2026</w:t>
       </w:r>
     </w:p>
     <w:p>
@@ -86,7 +86,7 @@
           <w:sz w:val="18"/>
           <w:szCs w:val="18"/>
         </w:rPr>
-        <w:t xml:space="preserve">  v1.4 ground rules:  All items are individual unique units  |  No sets or bundles  |  No branch transfers  |  No reservations  |  Serial numbers on all items</w:t>
+        <w:t xml:space="preserve">  v1.5 ground rules:  Showroom stock is quantity-based (standalone items and sets)  |  Custom orders remain serial-numbered  |  No branch transfers  |  No reservations</w:t>
       </w:r>
     </w:p>
     <w:p>
@@ -1468,7 +1468,7 @@
           <w:sz w:val="26"/>
           <w:szCs w:val="26"/>
         </w:rPr>
-        <w:t xml:space="preserve">C. Serial Number Requirement (All Items)</w:t>
+        <w:t xml:space="preserve">C. Serial Numbers (Custom Orders) &amp; Showroom Stock Model</w:t>
       </w:r>
     </w:p>
     <w:tbl>
@@ -1516,7 +1516,7 @@
                 <w:sz w:val="18"/>
                 <w:szCs w:val="18"/>
               </w:rPr>
-              <w:t xml:space="preserve">Applies to</w:t>
+              <w:t xml:space="preserve">Custom orders</w:t>
             </w:r>
           </w:p>
         </w:tc>
@@ -1548,7 +1548,7 @@
                 <w:sz w:val="18"/>
                 <w:szCs w:val="18"/>
               </w:rPr>
-              <w:t xml:space="preserve">Every showroom item AND every custom order</w:t>
+              <w:t xml:space="preserve">Each custom order is still tracked as a single, individually identified unit — no serial number field is required on the order record itself, but each order is inherently one physical piece being built for one customer.</w:t>
             </w:r>
           </w:p>
         </w:tc>
@@ -1582,7 +1582,7 @@
                 <w:sz w:val="18"/>
                 <w:szCs w:val="18"/>
               </w:rPr>
-              <w:t xml:space="preserve">Purpose</w:t>
+              <w:t xml:space="preserve">Showroom stock</w:t>
             </w:r>
           </w:p>
         </w:tc>
@@ -1614,73 +1614,7 @@
                 <w:sz w:val="18"/>
                 <w:szCs w:val="18"/>
               </w:rPr>
-              <w:t xml:space="preserve">Uniquely identify each individual item throughout its entire lifecycle</w:t>
-            </w:r>
-          </w:p>
-        </w:tc>
-      </w:tr>
-      <w:tr>
-        <w:tc>
-          <w:tcPr>
-            <w:tcW w:type="dxa" w:w="2200"/>
-            <w:tcBorders>
-              <w:top w:val="single" w:color="CCCCCC" w:sz="1"/>
-              <w:left w:val="single" w:color="CCCCCC" w:sz="1"/>
-              <w:bottom w:val="single" w:color="CCCCCC" w:sz="1"/>
-              <w:right w:val="single" w:color="CCCCCC" w:sz="1"/>
-            </w:tcBorders>
-            <w:shd w:fill="F2F2F2" w:val="clear"/>
-            <w:tcMar>
-              <w:top w:type="dxa" w:w="80"/>
-              <w:left w:type="dxa" w:w="140"/>
-              <w:bottom w:type="dxa" w:w="80"/>
-              <w:right w:type="dxa" w:w="140"/>
-            </w:tcMar>
-            <w:vAlign w:val="top"/>
-          </w:tcPr>
-          <w:p>
-            <w:r>
-              <w:rPr>
-                <w:rFonts w:ascii="Arial" w:cs="Arial" w:eastAsia="Arial" w:hAnsi="Arial"/>
-                <w:b/>
-                <w:bCs/>
-                <w:color w:val="000000"/>
-                <w:sz w:val="18"/>
-                <w:szCs w:val="18"/>
-              </w:rPr>
-              <w:t xml:space="preserve">Enforced at</w:t>
-            </w:r>
-          </w:p>
-        </w:tc>
-        <w:tc>
-          <w:tcPr>
-            <w:tcW w:type="dxa" w:w="7160"/>
-            <w:tcBorders>
-              <w:top w:val="single" w:color="CCCCCC" w:sz="1"/>
-              <w:left w:val="single" w:color="CCCCCC" w:sz="1"/>
-              <w:bottom w:val="single" w:color="CCCCCC" w:sz="1"/>
-              <w:right w:val="single" w:color="CCCCCC" w:sz="1"/>
-            </w:tcBorders>
-            <w:shd w:fill="FFFFFF" w:val="clear"/>
-            <w:tcMar>
-              <w:top w:type="dxa" w:w="80"/>
-              <w:left w:type="dxa" w:w="140"/>
-              <w:bottom w:type="dxa" w:w="80"/>
-              <w:right w:type="dxa" w:w="140"/>
-            </w:tcMar>
-            <w:vAlign w:val="top"/>
-          </w:tcPr>
-          <w:p>
-            <w:r>
-              <w:rPr>
-                <w:rFonts w:ascii="Arial" w:cs="Arial" w:eastAsia="Arial" w:hAnsi="Arial"/>
-                <w:b w:val="false"/>
-                <w:bCs w:val="false"/>
-                <w:color w:val="000000"/>
-                <w:sz w:val="18"/>
-                <w:szCs w:val="18"/>
-              </w:rPr>
-              <w:t xml:space="preserve">Item/order creation — requests without a valid unique serial number are rejected</w:t>
+              <w:t xml:space="preserve">Quantity-based, NOT serial-number-based. A showroom product (standalone item or set) is a single record with a unit count. Selling reduces the count; restocking increases it. See Part 4 for full detail.</w:t>
             </w:r>
           </w:p>
         </w:tc>
@@ -1703,7 +1637,7 @@
           <w:sz w:val="18"/>
           <w:szCs w:val="18"/>
         </w:rPr>
-        <w:t xml:space="preserve">●  No two items in the same branch may share a serial number.</w:t>
+        <w:t xml:space="preserve">●  Showroom items and sets are identified by SKU (auto-generated), not by a per-unit serial number.</w:t>
       </w:r>
     </w:p>
     <w:p>
@@ -1718,7 +1652,7 @@
           <w:sz w:val="18"/>
           <w:szCs w:val="18"/>
         </w:rPr>
-        <w:t xml:space="preserve">●  A serial number cannot be changed after creation.</w:t>
+        <w:t xml:space="preserve">●  Multiple physical units of the same product share one inventory record and one SKU.</w:t>
       </w:r>
     </w:p>
     <w:p>
@@ -1733,22 +1667,7 @@
           <w:sz w:val="18"/>
           <w:szCs w:val="18"/>
         </w:rPr>
-        <w:t xml:space="preserve">●  Searching by serial number always returns exactly one item.</w:t>
-      </w:r>
-    </w:p>
-    <w:p>
-      <w:pPr>
-        <w:spacing w:after="50" w:before="50"/>
-        <w:ind w:left="360"/>
-      </w:pPr>
-      <w:r>
-        <w:rPr>
-          <w:rFonts w:ascii="Arial" w:cs="Arial" w:eastAsia="Arial" w:hAnsi="Arial"/>
-          <w:color w:val="1F497D"/>
-          <w:sz w:val="18"/>
-          <w:szCs w:val="18"/>
-        </w:rPr>
-        <w:t xml:space="preserve">●  All items are individual units — no sets, bundles, or groups exist.</w:t>
+        <w:t xml:space="preserve">●  This is a change from the earlier one-serial-per-unit model — see Part 4 for the full quantity-based flow.</w:t>
       </w:r>
     </w:p>
     <w:p>
@@ -14278,1144 +14197,21 @@
           <w:sz w:val="36"/>
           <w:szCs w:val="36"/>
         </w:rPr>
-        <w:t xml:space="preserve">PART 4 — SHOWROOM MANAGEMENT</w:t>
+        <w:t xml:space="preserve">PART 4 — SHOWROOM STOCK MANAGEMENT</w:t>
       </w:r>
     </w:p>
     <w:p>
       <w:pPr>
-        <w:spacing w:after="100" w:before="320"/>
+        <w:spacing w:after="120"/>
       </w:pPr>
       <w:r>
         <w:rPr>
           <w:rFonts w:ascii="Arial" w:cs="Arial" w:eastAsia="Arial" w:hAnsi="Arial"/>
-          <w:b/>
-          <w:bCs/>
-          <w:color w:val="1F497D"/>
-          <w:sz w:val="26"/>
-          <w:szCs w:val="26"/>
-        </w:rPr>
-        <w:t xml:space="preserve">4.1. Adding a Showroom Item (Front Desk)</w:t>
-      </w:r>
-    </w:p>
-    <w:tbl>
-      <w:tblPr>
-        <w:tblW w:type="dxa" w:w="9360"/>
-        <w:tblBorders>
-          <w:top w:val="single" w:color="auto" w:sz="4"/>
-          <w:left w:val="single" w:color="auto" w:sz="4"/>
-          <w:bottom w:val="single" w:color="auto" w:sz="4"/>
-          <w:right w:val="single" w:color="auto" w:sz="4"/>
-          <w:insideH w:val="single" w:color="auto" w:sz="4"/>
-          <w:insideV w:val="single" w:color="auto" w:sz="4"/>
-        </w:tblBorders>
-      </w:tblPr>
-      <w:tblGrid>
-        <w:gridCol w:w="2200"/>
-        <w:gridCol w:w="7160"/>
-      </w:tblGrid>
-      <w:tr>
-        <w:tc>
-          <w:tcPr>
-            <w:tcW w:type="dxa" w:w="2200"/>
-            <w:tcBorders>
-              <w:top w:val="single" w:color="CCCCCC" w:sz="1"/>
-              <w:left w:val="single" w:color="CCCCCC" w:sz="1"/>
-              <w:bottom w:val="single" w:color="CCCCCC" w:sz="1"/>
-              <w:right w:val="single" w:color="CCCCCC" w:sz="1"/>
-            </w:tcBorders>
-            <w:shd w:fill="F2F2F2" w:val="clear"/>
-            <w:tcMar>
-              <w:top w:type="dxa" w:w="80"/>
-              <w:left w:type="dxa" w:w="140"/>
-              <w:bottom w:type="dxa" w:w="80"/>
-              <w:right w:type="dxa" w:w="140"/>
-            </w:tcMar>
-            <w:vAlign w:val="top"/>
-          </w:tcPr>
-          <w:p>
-            <w:r>
-              <w:rPr>
-                <w:rFonts w:ascii="Arial" w:cs="Arial" w:eastAsia="Arial" w:hAnsi="Arial"/>
-                <w:b/>
-                <w:bCs/>
-                <w:color w:val="000000"/>
-                <w:sz w:val="18"/>
-                <w:szCs w:val="18"/>
-              </w:rPr>
-              <w:t xml:space="preserve">Trigger</w:t>
-            </w:r>
-          </w:p>
-        </w:tc>
-        <w:tc>
-          <w:tcPr>
-            <w:tcW w:type="dxa" w:w="7160"/>
-            <w:tcBorders>
-              <w:top w:val="single" w:color="CCCCCC" w:sz="1"/>
-              <w:left w:val="single" w:color="CCCCCC" w:sz="1"/>
-              <w:bottom w:val="single" w:color="CCCCCC" w:sz="1"/>
-              <w:right w:val="single" w:color="CCCCCC" w:sz="1"/>
-            </w:tcBorders>
-            <w:shd w:fill="FFFFFF" w:val="clear"/>
-            <w:tcMar>
-              <w:top w:type="dxa" w:w="80"/>
-              <w:left w:type="dxa" w:w="140"/>
-              <w:bottom w:type="dxa" w:w="80"/>
-              <w:right w:type="dxa" w:w="140"/>
-            </w:tcMar>
-            <w:vAlign w:val="top"/>
-          </w:tcPr>
-          <w:p>
-            <w:r>
-              <w:rPr>
-                <w:rFonts w:ascii="Arial" w:cs="Arial" w:eastAsia="Arial" w:hAnsi="Arial"/>
-                <w:b w:val="false"/>
-                <w:bCs w:val="false"/>
-                <w:color w:val="000000"/>
-                <w:sz w:val="18"/>
-                <w:szCs w:val="18"/>
-              </w:rPr>
-              <w:t xml:space="preserve">New furniture arrives at the showroom floor and needs to be listed for sale</w:t>
-            </w:r>
-          </w:p>
-        </w:tc>
-      </w:tr>
-      <w:tr>
-        <w:tc>
-          <w:tcPr>
-            <w:tcW w:type="dxa" w:w="2200"/>
-            <w:tcBorders>
-              <w:top w:val="single" w:color="CCCCCC" w:sz="1"/>
-              <w:left w:val="single" w:color="CCCCCC" w:sz="1"/>
-              <w:bottom w:val="single" w:color="CCCCCC" w:sz="1"/>
-              <w:right w:val="single" w:color="CCCCCC" w:sz="1"/>
-            </w:tcBorders>
-            <w:shd w:fill="F2F2F2" w:val="clear"/>
-            <w:tcMar>
-              <w:top w:type="dxa" w:w="80"/>
-              <w:left w:type="dxa" w:w="140"/>
-              <w:bottom w:type="dxa" w:w="80"/>
-              <w:right w:type="dxa" w:w="140"/>
-            </w:tcMar>
-            <w:vAlign w:val="top"/>
-          </w:tcPr>
-          <w:p>
-            <w:r>
-              <w:rPr>
-                <w:rFonts w:ascii="Arial" w:cs="Arial" w:eastAsia="Arial" w:hAnsi="Arial"/>
-                <w:b/>
-                <w:bCs/>
-                <w:color w:val="000000"/>
-                <w:sz w:val="18"/>
-                <w:szCs w:val="18"/>
-              </w:rPr>
-              <w:t xml:space="preserve">Initiator</w:t>
-            </w:r>
-          </w:p>
-        </w:tc>
-        <w:tc>
-          <w:tcPr>
-            <w:tcW w:type="dxa" w:w="7160"/>
-            <w:tcBorders>
-              <w:top w:val="single" w:color="CCCCCC" w:sz="1"/>
-              <w:left w:val="single" w:color="CCCCCC" w:sz="1"/>
-              <w:bottom w:val="single" w:color="CCCCCC" w:sz="1"/>
-              <w:right w:val="single" w:color="CCCCCC" w:sz="1"/>
-            </w:tcBorders>
-            <w:shd w:fill="FFFFFF" w:val="clear"/>
-            <w:tcMar>
-              <w:top w:type="dxa" w:w="80"/>
-              <w:left w:type="dxa" w:w="140"/>
-              <w:bottom w:type="dxa" w:w="80"/>
-              <w:right w:type="dxa" w:w="140"/>
-            </w:tcMar>
-            <w:vAlign w:val="top"/>
-          </w:tcPr>
-          <w:p>
-            <w:r>
-              <w:rPr>
-                <w:rFonts w:ascii="Arial" w:cs="Arial" w:eastAsia="Arial" w:hAnsi="Arial"/>
-                <w:b w:val="false"/>
-                <w:bCs w:val="false"/>
-                <w:color w:val="000000"/>
-                <w:sz w:val="18"/>
-                <w:szCs w:val="18"/>
-              </w:rPr>
-              <w:t xml:space="preserve">Front Desk</w:t>
-            </w:r>
-          </w:p>
-        </w:tc>
-      </w:tr>
-      <w:tr>
-        <w:tc>
-          <w:tcPr>
-            <w:tcW w:type="dxa" w:w="2200"/>
-            <w:tcBorders>
-              <w:top w:val="single" w:color="CCCCCC" w:sz="1"/>
-              <w:left w:val="single" w:color="CCCCCC" w:sz="1"/>
-              <w:bottom w:val="single" w:color="CCCCCC" w:sz="1"/>
-              <w:right w:val="single" w:color="CCCCCC" w:sz="1"/>
-            </w:tcBorders>
-            <w:shd w:fill="F2F2F2" w:val="clear"/>
-            <w:tcMar>
-              <w:top w:type="dxa" w:w="80"/>
-              <w:left w:type="dxa" w:w="140"/>
-              <w:bottom w:type="dxa" w:w="80"/>
-              <w:right w:type="dxa" w:w="140"/>
-            </w:tcMar>
-            <w:vAlign w:val="top"/>
-          </w:tcPr>
-          <w:p>
-            <w:r>
-              <w:rPr>
-                <w:rFonts w:ascii="Arial" w:cs="Arial" w:eastAsia="Arial" w:hAnsi="Arial"/>
-                <w:b/>
-                <w:bCs/>
-                <w:color w:val="000000"/>
-                <w:sz w:val="18"/>
-                <w:szCs w:val="18"/>
-              </w:rPr>
-              <w:t xml:space="preserve">End State</w:t>
-            </w:r>
-          </w:p>
-        </w:tc>
-        <w:tc>
-          <w:tcPr>
-            <w:tcW w:type="dxa" w:w="7160"/>
-            <w:tcBorders>
-              <w:top w:val="single" w:color="CCCCCC" w:sz="1"/>
-              <w:left w:val="single" w:color="CCCCCC" w:sz="1"/>
-              <w:bottom w:val="single" w:color="CCCCCC" w:sz="1"/>
-              <w:right w:val="single" w:color="CCCCCC" w:sz="1"/>
-            </w:tcBorders>
-            <w:shd w:fill="FFFFFF" w:val="clear"/>
-            <w:tcMar>
-              <w:top w:type="dxa" w:w="80"/>
-              <w:left w:type="dxa" w:w="140"/>
-              <w:bottom w:type="dxa" w:w="80"/>
-              <w:right w:type="dxa" w:w="140"/>
-            </w:tcMar>
-            <w:vAlign w:val="top"/>
-          </w:tcPr>
-          <w:p>
-            <w:r>
-              <w:rPr>
-                <w:rFonts w:ascii="Arial" w:cs="Arial" w:eastAsia="Arial" w:hAnsi="Arial"/>
-                <w:b w:val="false"/>
-                <w:bCs w:val="false"/>
-                <w:color w:val="000000"/>
-                <w:sz w:val="18"/>
-                <w:szCs w:val="18"/>
-              </w:rPr>
-              <w:t xml:space="preserve">Item status = AVAILABLE in this branch showroom; searchable; sellable immediately</w:t>
-            </w:r>
-          </w:p>
-        </w:tc>
-      </w:tr>
-    </w:tbl>
-    <w:p>
-      <w:pPr>
-        <w:spacing w:after="80"/>
-      </w:pPr>
-    </w:p>
-    <w:tbl>
-      <w:tblPr>
-        <w:tblW w:type="dxa" w:w="9360"/>
-        <w:tblBorders>
-          <w:top w:val="single" w:color="auto" w:sz="4"/>
-          <w:left w:val="single" w:color="auto" w:sz="4"/>
-          <w:bottom w:val="single" w:color="auto" w:sz="4"/>
-          <w:right w:val="single" w:color="auto" w:sz="4"/>
-          <w:insideH w:val="single" w:color="auto" w:sz="4"/>
-          <w:insideV w:val="single" w:color="auto" w:sz="4"/>
-        </w:tblBorders>
-      </w:tblPr>
-      <w:tblGrid>
-        <w:gridCol w:w="500"/>
-        <w:gridCol w:w="1600"/>
-        <w:gridCol w:w="3600"/>
-        <w:gridCol w:w="3660"/>
-      </w:tblGrid>
-      <w:tr>
-        <w:tc>
-          <w:tcPr>
-            <w:tcW w:type="dxa" w:w="500"/>
-            <w:tcBorders>
-              <w:top w:val="single" w:color="1F497D" w:sz="1"/>
-              <w:left w:val="single" w:color="1F497D" w:sz="1"/>
-              <w:bottom w:val="single" w:color="1F497D" w:sz="1"/>
-              <w:right w:val="single" w:color="1F497D" w:sz="1"/>
-            </w:tcBorders>
-            <w:shd w:fill="1F497D" w:val="clear"/>
-            <w:tcMar>
-              <w:top w:type="dxa" w:w="80"/>
-              <w:left w:type="dxa" w:w="140"/>
-              <w:bottom w:type="dxa" w:w="80"/>
-              <w:right w:type="dxa" w:w="140"/>
-            </w:tcMar>
-          </w:tcPr>
-          <w:p>
-            <w:r>
-              <w:rPr>
-                <w:rFonts w:ascii="Arial" w:cs="Arial" w:eastAsia="Arial" w:hAnsi="Arial"/>
-                <w:b/>
-                <w:bCs/>
-                <w:color w:val="FFFFFF"/>
-                <w:sz w:val="18"/>
-                <w:szCs w:val="18"/>
-              </w:rPr>
-              <w:t xml:space="preserve">#</w:t>
-            </w:r>
-          </w:p>
-        </w:tc>
-        <w:tc>
-          <w:tcPr>
-            <w:tcW w:type="dxa" w:w="1600"/>
-            <w:tcBorders>
-              <w:top w:val="single" w:color="1F497D" w:sz="1"/>
-              <w:left w:val="single" w:color="1F497D" w:sz="1"/>
-              <w:bottom w:val="single" w:color="1F497D" w:sz="1"/>
-              <w:right w:val="single" w:color="1F497D" w:sz="1"/>
-            </w:tcBorders>
-            <w:shd w:fill="1F497D" w:val="clear"/>
-            <w:tcMar>
-              <w:top w:type="dxa" w:w="80"/>
-              <w:left w:type="dxa" w:w="140"/>
-              <w:bottom w:type="dxa" w:w="80"/>
-              <w:right w:type="dxa" w:w="140"/>
-            </w:tcMar>
-          </w:tcPr>
-          <w:p>
-            <w:r>
-              <w:rPr>
-                <w:rFonts w:ascii="Arial" w:cs="Arial" w:eastAsia="Arial" w:hAnsi="Arial"/>
-                <w:b/>
-                <w:bCs/>
-                <w:color w:val="FFFFFF"/>
-                <w:sz w:val="18"/>
-                <w:szCs w:val="18"/>
-              </w:rPr>
-              <w:t xml:space="preserve">Actor</w:t>
-            </w:r>
-          </w:p>
-        </w:tc>
-        <w:tc>
-          <w:tcPr>
-            <w:tcW w:type="dxa" w:w="3600"/>
-            <w:tcBorders>
-              <w:top w:val="single" w:color="1F497D" w:sz="1"/>
-              <w:left w:val="single" w:color="1F497D" w:sz="1"/>
-              <w:bottom w:val="single" w:color="1F497D" w:sz="1"/>
-              <w:right w:val="single" w:color="1F497D" w:sz="1"/>
-            </w:tcBorders>
-            <w:shd w:fill="1F497D" w:val="clear"/>
-            <w:tcMar>
-              <w:top w:type="dxa" w:w="80"/>
-              <w:left w:type="dxa" w:w="140"/>
-              <w:bottom w:type="dxa" w:w="80"/>
-              <w:right w:type="dxa" w:w="140"/>
-            </w:tcMar>
-          </w:tcPr>
-          <w:p>
-            <w:r>
-              <w:rPr>
-                <w:rFonts w:ascii="Arial" w:cs="Arial" w:eastAsia="Arial" w:hAnsi="Arial"/>
-                <w:b/>
-                <w:bCs/>
-                <w:color w:val="FFFFFF"/>
-                <w:sz w:val="18"/>
-                <w:szCs w:val="18"/>
-              </w:rPr>
-              <w:t xml:space="preserve">Action</w:t>
-            </w:r>
-          </w:p>
-        </w:tc>
-        <w:tc>
-          <w:tcPr>
-            <w:tcW w:type="dxa" w:w="3660"/>
-            <w:tcBorders>
-              <w:top w:val="single" w:color="1F497D" w:sz="1"/>
-              <w:left w:val="single" w:color="1F497D" w:sz="1"/>
-              <w:bottom w:val="single" w:color="1F497D" w:sz="1"/>
-              <w:right w:val="single" w:color="1F497D" w:sz="1"/>
-            </w:tcBorders>
-            <w:shd w:fill="1F497D" w:val="clear"/>
-            <w:tcMar>
-              <w:top w:type="dxa" w:w="80"/>
-              <w:left w:type="dxa" w:w="140"/>
-              <w:bottom w:type="dxa" w:w="80"/>
-              <w:right w:type="dxa" w:w="140"/>
-            </w:tcMar>
-          </w:tcPr>
-          <w:p>
-            <w:r>
-              <w:rPr>
-                <w:rFonts w:ascii="Arial" w:cs="Arial" w:eastAsia="Arial" w:hAnsi="Arial"/>
-                <w:b/>
-                <w:bCs/>
-                <w:color w:val="FFFFFF"/>
-                <w:sz w:val="18"/>
-                <w:szCs w:val="18"/>
-              </w:rPr>
-              <w:t xml:space="preserve">System Response</w:t>
-            </w:r>
-          </w:p>
-        </w:tc>
-      </w:tr>
-      <w:tr>
-        <w:tc>
-          <w:tcPr>
-            <w:tcW w:type="dxa" w:w="500"/>
-            <w:tcBorders>
-              <w:top w:val="single" w:color="CCCCCC" w:sz="1"/>
-              <w:left w:val="single" w:color="CCCCCC" w:sz="1"/>
-              <w:bottom w:val="single" w:color="CCCCCC" w:sz="1"/>
-              <w:right w:val="single" w:color="CCCCCC" w:sz="1"/>
-            </w:tcBorders>
-            <w:shd w:fill="F2F2F2" w:val="clear"/>
-            <w:tcMar>
-              <w:top w:type="dxa" w:w="80"/>
-              <w:left w:type="dxa" w:w="140"/>
-              <w:bottom w:type="dxa" w:w="80"/>
-              <w:right w:type="dxa" w:w="140"/>
-            </w:tcMar>
-            <w:vAlign w:val="top"/>
-          </w:tcPr>
-          <w:p>
-            <w:r>
-              <w:rPr>
-                <w:rFonts w:ascii="Arial" w:cs="Arial" w:eastAsia="Arial" w:hAnsi="Arial"/>
-                <w:b/>
-                <w:bCs/>
-                <w:color w:val="000000"/>
-                <w:sz w:val="18"/>
-                <w:szCs w:val="18"/>
-              </w:rPr>
-              <w:t xml:space="preserve">1</w:t>
-            </w:r>
-          </w:p>
-        </w:tc>
-        <w:tc>
-          <w:tcPr>
-            <w:tcW w:type="dxa" w:w="1600"/>
-            <w:tcBorders>
-              <w:top w:val="single" w:color="CCCCCC" w:sz="1"/>
-              <w:left w:val="single" w:color="CCCCCC" w:sz="1"/>
-              <w:bottom w:val="single" w:color="CCCCCC" w:sz="1"/>
-              <w:right w:val="single" w:color="CCCCCC" w:sz="1"/>
-            </w:tcBorders>
-            <w:shd w:fill="D6E4F0" w:val="clear"/>
-            <w:tcMar>
-              <w:top w:type="dxa" w:w="80"/>
-              <w:left w:type="dxa" w:w="140"/>
-              <w:bottom w:type="dxa" w:w="80"/>
-              <w:right w:type="dxa" w:w="140"/>
-            </w:tcMar>
-            <w:vAlign w:val="top"/>
-          </w:tcPr>
-          <w:p>
-            <w:r>
-              <w:rPr>
-                <w:rFonts w:ascii="Arial" w:cs="Arial" w:eastAsia="Arial" w:hAnsi="Arial"/>
-                <w:b w:val="false"/>
-                <w:bCs w:val="false"/>
-                <w:color w:val="000000"/>
-                <w:sz w:val="18"/>
-                <w:szCs w:val="18"/>
-              </w:rPr>
-              <w:t xml:space="preserve">Front Desk</w:t>
-            </w:r>
-          </w:p>
-        </w:tc>
-        <w:tc>
-          <w:tcPr>
-            <w:tcW w:type="dxa" w:w="3600"/>
-            <w:tcBorders>
-              <w:top w:val="single" w:color="CCCCCC" w:sz="1"/>
-              <w:left w:val="single" w:color="CCCCCC" w:sz="1"/>
-              <w:bottom w:val="single" w:color="CCCCCC" w:sz="1"/>
-              <w:right w:val="single" w:color="CCCCCC" w:sz="1"/>
-            </w:tcBorders>
-            <w:shd w:fill="FFFFFF" w:val="clear"/>
-            <w:tcMar>
-              <w:top w:type="dxa" w:w="80"/>
-              <w:left w:type="dxa" w:w="140"/>
-              <w:bottom w:type="dxa" w:w="80"/>
-              <w:right w:type="dxa" w:w="140"/>
-            </w:tcMar>
-            <w:vAlign w:val="top"/>
-          </w:tcPr>
-          <w:p>
-            <w:r>
-              <w:rPr>
-                <w:rFonts w:ascii="Arial" w:cs="Arial" w:eastAsia="Arial" w:hAnsi="Arial"/>
-                <w:b w:val="false"/>
-                <w:bCs w:val="false"/>
-                <w:color w:val="000000"/>
-                <w:sz w:val="18"/>
-                <w:szCs w:val="18"/>
-              </w:rPr>
-              <w:t xml:space="preserve">Opens 'Shop' section -&gt; 'Showroom Stock' tab. Clicks 'Add Item'.</w:t>
-            </w:r>
-          </w:p>
-        </w:tc>
-        <w:tc>
-          <w:tcPr>
-            <w:tcW w:type="dxa" w:w="3660"/>
-            <w:tcBorders>
-              <w:top w:val="single" w:color="CCCCCC" w:sz="1"/>
-              <w:left w:val="single" w:color="CCCCCC" w:sz="1"/>
-              <w:bottom w:val="single" w:color="CCCCCC" w:sz="1"/>
-              <w:right w:val="single" w:color="CCCCCC" w:sz="1"/>
-            </w:tcBorders>
-            <w:shd w:fill="E2EFDA" w:val="clear"/>
-            <w:tcMar>
-              <w:top w:type="dxa" w:w="80"/>
-              <w:left w:type="dxa" w:w="140"/>
-              <w:bottom w:type="dxa" w:w="80"/>
-              <w:right w:type="dxa" w:w="140"/>
-            </w:tcMar>
-            <w:vAlign w:val="top"/>
-          </w:tcPr>
-          <w:p>
-            <w:r>
-              <w:rPr>
-                <w:rFonts w:ascii="Arial" w:cs="Arial" w:eastAsia="Arial" w:hAnsi="Arial"/>
-                <w:b w:val="false"/>
-                <w:bCs w:val="false"/>
-                <w:color w:val="000000"/>
-                <w:sz w:val="18"/>
-                <w:szCs w:val="18"/>
-              </w:rPr>
-              <w:t xml:space="preserve">Inventory screen loaded, scoped to this Front Desk branch_id</w:t>
-            </w:r>
-          </w:p>
-        </w:tc>
-      </w:tr>
-      <w:tr>
-        <w:tc>
-          <w:tcPr>
-            <w:tcW w:type="dxa" w:w="500"/>
-            <w:tcBorders>
-              <w:top w:val="single" w:color="CCCCCC" w:sz="1"/>
-              <w:left w:val="single" w:color="CCCCCC" w:sz="1"/>
-              <w:bottom w:val="single" w:color="CCCCCC" w:sz="1"/>
-              <w:right w:val="single" w:color="CCCCCC" w:sz="1"/>
-            </w:tcBorders>
-            <w:shd w:fill="F2F2F2" w:val="clear"/>
-            <w:tcMar>
-              <w:top w:type="dxa" w:w="80"/>
-              <w:left w:type="dxa" w:w="140"/>
-              <w:bottom w:type="dxa" w:w="80"/>
-              <w:right w:type="dxa" w:w="140"/>
-            </w:tcMar>
-            <w:vAlign w:val="top"/>
-          </w:tcPr>
-          <w:p>
-            <w:r>
-              <w:rPr>
-                <w:rFonts w:ascii="Arial" w:cs="Arial" w:eastAsia="Arial" w:hAnsi="Arial"/>
-                <w:b/>
-                <w:bCs/>
-                <w:color w:val="000000"/>
-                <w:sz w:val="18"/>
-                <w:szCs w:val="18"/>
-              </w:rPr>
-              <w:t xml:space="preserve">2</w:t>
-            </w:r>
-          </w:p>
-        </w:tc>
-        <w:tc>
-          <w:tcPr>
-            <w:tcW w:type="dxa" w:w="1600"/>
-            <w:tcBorders>
-              <w:top w:val="single" w:color="CCCCCC" w:sz="1"/>
-              <w:left w:val="single" w:color="CCCCCC" w:sz="1"/>
-              <w:bottom w:val="single" w:color="CCCCCC" w:sz="1"/>
-              <w:right w:val="single" w:color="CCCCCC" w:sz="1"/>
-            </w:tcBorders>
-            <w:shd w:fill="D6E4F0" w:val="clear"/>
-            <w:tcMar>
-              <w:top w:type="dxa" w:w="80"/>
-              <w:left w:type="dxa" w:w="140"/>
-              <w:bottom w:type="dxa" w:w="80"/>
-              <w:right w:type="dxa" w:w="140"/>
-            </w:tcMar>
-            <w:vAlign w:val="top"/>
-          </w:tcPr>
-          <w:p>
-            <w:r>
-              <w:rPr>
-                <w:rFonts w:ascii="Arial" w:cs="Arial" w:eastAsia="Arial" w:hAnsi="Arial"/>
-                <w:b w:val="false"/>
-                <w:bCs w:val="false"/>
-                <w:color w:val="000000"/>
-                <w:sz w:val="18"/>
-                <w:szCs w:val="18"/>
-              </w:rPr>
-              <w:t xml:space="preserve">Front Desk</w:t>
-            </w:r>
-          </w:p>
-        </w:tc>
-        <w:tc>
-          <w:tcPr>
-            <w:tcW w:type="dxa" w:w="3600"/>
-            <w:tcBorders>
-              <w:top w:val="single" w:color="CCCCCC" w:sz="1"/>
-              <w:left w:val="single" w:color="CCCCCC" w:sz="1"/>
-              <w:bottom w:val="single" w:color="CCCCCC" w:sz="1"/>
-              <w:right w:val="single" w:color="CCCCCC" w:sz="1"/>
-            </w:tcBorders>
-            <w:shd w:fill="FFFFFF" w:val="clear"/>
-            <w:tcMar>
-              <w:top w:type="dxa" w:w="80"/>
-              <w:left w:type="dxa" w:w="140"/>
-              <w:bottom w:type="dxa" w:w="80"/>
-              <w:right w:type="dxa" w:w="140"/>
-            </w:tcMar>
-            <w:vAlign w:val="top"/>
-          </w:tcPr>
-          <w:p>
-            <w:r>
-              <w:rPr>
-                <w:rFonts w:ascii="Arial" w:cs="Arial" w:eastAsia="Arial" w:hAnsi="Arial"/>
-                <w:b w:val="false"/>
-                <w:bCs w:val="false"/>
-                <w:color w:val="000000"/>
-                <w:sz w:val="18"/>
-                <w:szCs w:val="18"/>
-              </w:rPr>
-              <w:t xml:space="preserve">Fills in: item name, category (optional), SKU, serial number (unique), set price. Submits.</w:t>
-            </w:r>
-          </w:p>
-        </w:tc>
-        <w:tc>
-          <w:tcPr>
-            <w:tcW w:type="dxa" w:w="3660"/>
-            <w:tcBorders>
-              <w:top w:val="single" w:color="CCCCCC" w:sz="1"/>
-              <w:left w:val="single" w:color="CCCCCC" w:sz="1"/>
-              <w:bottom w:val="single" w:color="CCCCCC" w:sz="1"/>
-              <w:right w:val="single" w:color="CCCCCC" w:sz="1"/>
-            </w:tcBorders>
-            <w:shd w:fill="E2EFDA" w:val="clear"/>
-            <w:tcMar>
-              <w:top w:type="dxa" w:w="80"/>
-              <w:left w:type="dxa" w:w="140"/>
-              <w:bottom w:type="dxa" w:w="80"/>
-              <w:right w:type="dxa" w:w="140"/>
-            </w:tcMar>
-            <w:vAlign w:val="top"/>
-          </w:tcPr>
-          <w:p>
-            <w:r>
-              <w:rPr>
-                <w:rFonts w:ascii="Arial" w:cs="Arial" w:eastAsia="Arial" w:hAnsi="Arial"/>
-                <w:b w:val="false"/>
-                <w:bCs w:val="false"/>
-                <w:color w:val="000000"/>
-                <w:sz w:val="18"/>
-                <w:szCs w:val="18"/>
-              </w:rPr>
-              <w:t xml:space="preserve">—</w:t>
-            </w:r>
-          </w:p>
-        </w:tc>
-      </w:tr>
-      <w:tr>
-        <w:tc>
-          <w:tcPr>
-            <w:tcW w:type="dxa" w:w="500"/>
-            <w:tcBorders>
-              <w:top w:val="single" w:color="CCCCCC" w:sz="1"/>
-              <w:left w:val="single" w:color="CCCCCC" w:sz="1"/>
-              <w:bottom w:val="single" w:color="CCCCCC" w:sz="1"/>
-              <w:right w:val="single" w:color="CCCCCC" w:sz="1"/>
-            </w:tcBorders>
-            <w:shd w:fill="F2F2F2" w:val="clear"/>
-            <w:tcMar>
-              <w:top w:type="dxa" w:w="80"/>
-              <w:left w:type="dxa" w:w="140"/>
-              <w:bottom w:type="dxa" w:w="80"/>
-              <w:right w:type="dxa" w:w="140"/>
-            </w:tcMar>
-            <w:vAlign w:val="top"/>
-          </w:tcPr>
-          <w:p>
-            <w:r>
-              <w:rPr>
-                <w:rFonts w:ascii="Arial" w:cs="Arial" w:eastAsia="Arial" w:hAnsi="Arial"/>
-                <w:b/>
-                <w:bCs/>
-                <w:color w:val="000000"/>
-                <w:sz w:val="18"/>
-                <w:szCs w:val="18"/>
-              </w:rPr>
-              <w:t xml:space="preserve">3</w:t>
-            </w:r>
-          </w:p>
-        </w:tc>
-        <w:tc>
-          <w:tcPr>
-            <w:tcW w:type="dxa" w:w="1600"/>
-            <w:tcBorders>
-              <w:top w:val="single" w:color="CCCCCC" w:sz="1"/>
-              <w:left w:val="single" w:color="CCCCCC" w:sz="1"/>
-              <w:bottom w:val="single" w:color="CCCCCC" w:sz="1"/>
-              <w:right w:val="single" w:color="CCCCCC" w:sz="1"/>
-            </w:tcBorders>
-            <w:shd w:fill="D6E4F0" w:val="clear"/>
-            <w:tcMar>
-              <w:top w:type="dxa" w:w="80"/>
-              <w:left w:type="dxa" w:w="140"/>
-              <w:bottom w:type="dxa" w:w="80"/>
-              <w:right w:type="dxa" w:w="140"/>
-            </w:tcMar>
-            <w:vAlign w:val="top"/>
-          </w:tcPr>
-          <w:p>
-            <w:r>
-              <w:rPr>
-                <w:rFonts w:ascii="Arial" w:cs="Arial" w:eastAsia="Arial" w:hAnsi="Arial"/>
-                <w:b w:val="false"/>
-                <w:bCs w:val="false"/>
-                <w:color w:val="000000"/>
-                <w:sz w:val="18"/>
-                <w:szCs w:val="18"/>
-              </w:rPr>
-              <w:t xml:space="preserve">System</w:t>
-            </w:r>
-          </w:p>
-        </w:tc>
-        <w:tc>
-          <w:tcPr>
-            <w:tcW w:type="dxa" w:w="3600"/>
-            <w:tcBorders>
-              <w:top w:val="single" w:color="CCCCCC" w:sz="1"/>
-              <w:left w:val="single" w:color="CCCCCC" w:sz="1"/>
-              <w:bottom w:val="single" w:color="CCCCCC" w:sz="1"/>
-              <w:right w:val="single" w:color="CCCCCC" w:sz="1"/>
-            </w:tcBorders>
-            <w:shd w:fill="FFFFFF" w:val="clear"/>
-            <w:tcMar>
-              <w:top w:type="dxa" w:w="80"/>
-              <w:left w:type="dxa" w:w="140"/>
-              <w:bottom w:type="dxa" w:w="80"/>
-              <w:right w:type="dxa" w:w="140"/>
-            </w:tcMar>
-            <w:vAlign w:val="top"/>
-          </w:tcPr>
-          <w:p>
-            <w:r>
-              <w:rPr>
-                <w:rFonts w:ascii="Arial" w:cs="Arial" w:eastAsia="Arial" w:hAnsi="Arial"/>
-                <w:b w:val="false"/>
-                <w:bCs w:val="false"/>
-                <w:color w:val="000000"/>
-                <w:sz w:val="18"/>
-                <w:szCs w:val="18"/>
-              </w:rPr>
-              <w:t xml:space="preserve">—</w:t>
-            </w:r>
-          </w:p>
-        </w:tc>
-        <w:tc>
-          <w:tcPr>
-            <w:tcW w:type="dxa" w:w="3660"/>
-            <w:tcBorders>
-              <w:top w:val="single" w:color="CCCCCC" w:sz="1"/>
-              <w:left w:val="single" w:color="CCCCCC" w:sz="1"/>
-              <w:bottom w:val="single" w:color="CCCCCC" w:sz="1"/>
-              <w:right w:val="single" w:color="CCCCCC" w:sz="1"/>
-            </w:tcBorders>
-            <w:shd w:fill="E2EFDA" w:val="clear"/>
-            <w:tcMar>
-              <w:top w:type="dxa" w:w="80"/>
-              <w:left w:type="dxa" w:w="140"/>
-              <w:bottom w:type="dxa" w:w="80"/>
-              <w:right w:type="dxa" w:w="140"/>
-            </w:tcMar>
-            <w:vAlign w:val="top"/>
-          </w:tcPr>
-          <w:p>
-            <w:r>
-              <w:rPr>
-                <w:rFonts w:ascii="Arial" w:cs="Arial" w:eastAsia="Arial" w:hAnsi="Arial"/>
-                <w:b w:val="false"/>
-                <w:bCs w:val="false"/>
-                <w:color w:val="000000"/>
-                <w:sz w:val="18"/>
-                <w:szCs w:val="18"/>
-              </w:rPr>
-              <w:t xml:space="preserve">Validates: serial number must be unique within this branch. Duplicate -&gt; rejected with error.</w:t>
-            </w:r>
-          </w:p>
-        </w:tc>
-      </w:tr>
-      <w:tr>
-        <w:tc>
-          <w:tcPr>
-            <w:tcW w:type="dxa" w:w="500"/>
-            <w:tcBorders>
-              <w:top w:val="single" w:color="CCCCCC" w:sz="1"/>
-              <w:left w:val="single" w:color="CCCCCC" w:sz="1"/>
-              <w:bottom w:val="single" w:color="CCCCCC" w:sz="1"/>
-              <w:right w:val="single" w:color="CCCCCC" w:sz="1"/>
-            </w:tcBorders>
-            <w:shd w:fill="F2F2F2" w:val="clear"/>
-            <w:tcMar>
-              <w:top w:type="dxa" w:w="80"/>
-              <w:left w:type="dxa" w:w="140"/>
-              <w:bottom w:type="dxa" w:w="80"/>
-              <w:right w:type="dxa" w:w="140"/>
-            </w:tcMar>
-            <w:vAlign w:val="top"/>
-          </w:tcPr>
-          <w:p>
-            <w:r>
-              <w:rPr>
-                <w:rFonts w:ascii="Arial" w:cs="Arial" w:eastAsia="Arial" w:hAnsi="Arial"/>
-                <w:b/>
-                <w:bCs/>
-                <w:color w:val="000000"/>
-                <w:sz w:val="18"/>
-                <w:szCs w:val="18"/>
-              </w:rPr>
-              <w:t xml:space="preserve">4</w:t>
-            </w:r>
-          </w:p>
-        </w:tc>
-        <w:tc>
-          <w:tcPr>
-            <w:tcW w:type="dxa" w:w="1600"/>
-            <w:tcBorders>
-              <w:top w:val="single" w:color="CCCCCC" w:sz="1"/>
-              <w:left w:val="single" w:color="CCCCCC" w:sz="1"/>
-              <w:bottom w:val="single" w:color="CCCCCC" w:sz="1"/>
-              <w:right w:val="single" w:color="CCCCCC" w:sz="1"/>
-            </w:tcBorders>
-            <w:shd w:fill="D6E4F0" w:val="clear"/>
-            <w:tcMar>
-              <w:top w:type="dxa" w:w="80"/>
-              <w:left w:type="dxa" w:w="140"/>
-              <w:bottom w:type="dxa" w:w="80"/>
-              <w:right w:type="dxa" w:w="140"/>
-            </w:tcMar>
-            <w:vAlign w:val="top"/>
-          </w:tcPr>
-          <w:p>
-            <w:r>
-              <w:rPr>
-                <w:rFonts w:ascii="Arial" w:cs="Arial" w:eastAsia="Arial" w:hAnsi="Arial"/>
-                <w:b w:val="false"/>
-                <w:bCs w:val="false"/>
-                <w:color w:val="000000"/>
-                <w:sz w:val="18"/>
-                <w:szCs w:val="18"/>
-              </w:rPr>
-              <w:t xml:space="preserve">System</w:t>
-            </w:r>
-          </w:p>
-        </w:tc>
-        <w:tc>
-          <w:tcPr>
-            <w:tcW w:type="dxa" w:w="3600"/>
-            <w:tcBorders>
-              <w:top w:val="single" w:color="CCCCCC" w:sz="1"/>
-              <w:left w:val="single" w:color="CCCCCC" w:sz="1"/>
-              <w:bottom w:val="single" w:color="CCCCCC" w:sz="1"/>
-              <w:right w:val="single" w:color="CCCCCC" w:sz="1"/>
-            </w:tcBorders>
-            <w:shd w:fill="FFFFFF" w:val="clear"/>
-            <w:tcMar>
-              <w:top w:type="dxa" w:w="80"/>
-              <w:left w:type="dxa" w:w="140"/>
-              <w:bottom w:type="dxa" w:w="80"/>
-              <w:right w:type="dxa" w:w="140"/>
-            </w:tcMar>
-            <w:vAlign w:val="top"/>
-          </w:tcPr>
-          <w:p>
-            <w:r>
-              <w:rPr>
-                <w:rFonts w:ascii="Arial" w:cs="Arial" w:eastAsia="Arial" w:hAnsi="Arial"/>
-                <w:b w:val="false"/>
-                <w:bCs w:val="false"/>
-                <w:color w:val="000000"/>
-                <w:sz w:val="18"/>
-                <w:szCs w:val="18"/>
-              </w:rPr>
-              <w:t xml:space="preserve">—</w:t>
-            </w:r>
-          </w:p>
-        </w:tc>
-        <w:tc>
-          <w:tcPr>
-            <w:tcW w:type="dxa" w:w="3660"/>
-            <w:tcBorders>
-              <w:top w:val="single" w:color="CCCCCC" w:sz="1"/>
-              <w:left w:val="single" w:color="CCCCCC" w:sz="1"/>
-              <w:bottom w:val="single" w:color="CCCCCC" w:sz="1"/>
-              <w:right w:val="single" w:color="CCCCCC" w:sz="1"/>
-            </w:tcBorders>
-            <w:shd w:fill="E2EFDA" w:val="clear"/>
-            <w:tcMar>
-              <w:top w:type="dxa" w:w="80"/>
-              <w:left w:type="dxa" w:w="140"/>
-              <w:bottom w:type="dxa" w:w="80"/>
-              <w:right w:type="dxa" w:w="140"/>
-            </w:tcMar>
-            <w:vAlign w:val="top"/>
-          </w:tcPr>
-          <w:p>
-            <w:r>
-              <w:rPr>
-                <w:rFonts w:ascii="Arial" w:cs="Arial" w:eastAsia="Arial" w:hAnsi="Arial"/>
-                <w:b w:val="false"/>
-                <w:bCs w:val="false"/>
-                <w:color w:val="000000"/>
-                <w:sz w:val="18"/>
-                <w:szCs w:val="18"/>
-              </w:rPr>
-              <w:t xml:space="preserve">POST /api/shop/items/ -- item created with status=AVAILABLE, branch = Front Desk branch; serial number stored permanently</w:t>
-            </w:r>
-          </w:p>
-        </w:tc>
-      </w:tr>
-      <w:tr>
-        <w:tc>
-          <w:tcPr>
-            <w:tcW w:type="dxa" w:w="500"/>
-            <w:tcBorders>
-              <w:top w:val="single" w:color="CCCCCC" w:sz="1"/>
-              <w:left w:val="single" w:color="CCCCCC" w:sz="1"/>
-              <w:bottom w:val="single" w:color="CCCCCC" w:sz="1"/>
-              <w:right w:val="single" w:color="CCCCCC" w:sz="1"/>
-            </w:tcBorders>
-            <w:shd w:fill="F2F2F2" w:val="clear"/>
-            <w:tcMar>
-              <w:top w:type="dxa" w:w="80"/>
-              <w:left w:type="dxa" w:w="140"/>
-              <w:bottom w:type="dxa" w:w="80"/>
-              <w:right w:type="dxa" w:w="140"/>
-            </w:tcMar>
-            <w:vAlign w:val="top"/>
-          </w:tcPr>
-          <w:p>
-            <w:r>
-              <w:rPr>
-                <w:rFonts w:ascii="Arial" w:cs="Arial" w:eastAsia="Arial" w:hAnsi="Arial"/>
-                <w:b/>
-                <w:bCs/>
-                <w:color w:val="000000"/>
-                <w:sz w:val="18"/>
-                <w:szCs w:val="18"/>
-              </w:rPr>
-              <w:t xml:space="preserve">5</w:t>
-            </w:r>
-          </w:p>
-        </w:tc>
-        <w:tc>
-          <w:tcPr>
-            <w:tcW w:type="dxa" w:w="1600"/>
-            <w:tcBorders>
-              <w:top w:val="single" w:color="CCCCCC" w:sz="1"/>
-              <w:left w:val="single" w:color="CCCCCC" w:sz="1"/>
-              <w:bottom w:val="single" w:color="CCCCCC" w:sz="1"/>
-              <w:right w:val="single" w:color="CCCCCC" w:sz="1"/>
-            </w:tcBorders>
-            <w:shd w:fill="D6E4F0" w:val="clear"/>
-            <w:tcMar>
-              <w:top w:type="dxa" w:w="80"/>
-              <w:left w:type="dxa" w:w="140"/>
-              <w:bottom w:type="dxa" w:w="80"/>
-              <w:right w:type="dxa" w:w="140"/>
-            </w:tcMar>
-            <w:vAlign w:val="top"/>
-          </w:tcPr>
-          <w:p>
-            <w:r>
-              <w:rPr>
-                <w:rFonts w:ascii="Arial" w:cs="Arial" w:eastAsia="Arial" w:hAnsi="Arial"/>
-                <w:b w:val="false"/>
-                <w:bCs w:val="false"/>
-                <w:color w:val="000000"/>
-                <w:sz w:val="18"/>
-                <w:szCs w:val="18"/>
-              </w:rPr>
-              <w:t xml:space="preserve">System</w:t>
-            </w:r>
-          </w:p>
-        </w:tc>
-        <w:tc>
-          <w:tcPr>
-            <w:tcW w:type="dxa" w:w="3600"/>
-            <w:tcBorders>
-              <w:top w:val="single" w:color="CCCCCC" w:sz="1"/>
-              <w:left w:val="single" w:color="CCCCCC" w:sz="1"/>
-              <w:bottom w:val="single" w:color="CCCCCC" w:sz="1"/>
-              <w:right w:val="single" w:color="CCCCCC" w:sz="1"/>
-            </w:tcBorders>
-            <w:shd w:fill="FFFFFF" w:val="clear"/>
-            <w:tcMar>
-              <w:top w:type="dxa" w:w="80"/>
-              <w:left w:type="dxa" w:w="140"/>
-              <w:bottom w:type="dxa" w:w="80"/>
-              <w:right w:type="dxa" w:w="140"/>
-            </w:tcMar>
-            <w:vAlign w:val="top"/>
-          </w:tcPr>
-          <w:p>
-            <w:r>
-              <w:rPr>
-                <w:rFonts w:ascii="Arial" w:cs="Arial" w:eastAsia="Arial" w:hAnsi="Arial"/>
-                <w:b w:val="false"/>
-                <w:bCs w:val="false"/>
-                <w:color w:val="000000"/>
-                <w:sz w:val="18"/>
-                <w:szCs w:val="18"/>
-              </w:rPr>
-              <w:t xml:space="preserve">—</w:t>
-            </w:r>
-          </w:p>
-        </w:tc>
-        <w:tc>
-          <w:tcPr>
-            <w:tcW w:type="dxa" w:w="3660"/>
-            <w:tcBorders>
-              <w:top w:val="single" w:color="CCCCCC" w:sz="1"/>
-              <w:left w:val="single" w:color="CCCCCC" w:sz="1"/>
-              <w:bottom w:val="single" w:color="CCCCCC" w:sz="1"/>
-              <w:right w:val="single" w:color="CCCCCC" w:sz="1"/>
-            </w:tcBorders>
-            <w:shd w:fill="E2EFDA" w:val="clear"/>
-            <w:tcMar>
-              <w:top w:type="dxa" w:w="80"/>
-              <w:left w:type="dxa" w:w="140"/>
-              <w:bottom w:type="dxa" w:w="80"/>
-              <w:right w:type="dxa" w:w="140"/>
-            </w:tcMar>
-            <w:vAlign w:val="top"/>
-          </w:tcPr>
-          <w:p>
-            <w:r>
-              <w:rPr>
-                <w:rFonts w:ascii="Arial" w:cs="Arial" w:eastAsia="Arial" w:hAnsi="Arial"/>
-                <w:b w:val="false"/>
-                <w:bCs w:val="false"/>
-                <w:color w:val="000000"/>
-                <w:sz w:val="18"/>
-                <w:szCs w:val="18"/>
-              </w:rPr>
-              <w:t xml:space="preserve">Item appears immediately in the Showroom Stock grid as AVAILABLE. Searchable by name or SKU.</w:t>
-            </w:r>
-          </w:p>
-        </w:tc>
-      </w:tr>
-    </w:tbl>
-    <w:p>
-      <w:pPr>
-        <w:spacing w:after="80"/>
-      </w:pPr>
-    </w:p>
-    <w:p>
-      <w:pPr>
-        <w:spacing w:after="50" w:before="50"/>
-        <w:ind w:left="360"/>
-      </w:pPr>
-      <w:r>
-        <w:rPr>
-          <w:rFonts w:ascii="Arial" w:cs="Arial" w:eastAsia="Arial" w:hAnsi="Arial"/>
-          <w:color w:val="1F497D"/>
+          <w:color w:val="000000"/>
           <w:sz w:val="18"/>
           <w:szCs w:val="18"/>
         </w:rPr>
-        <w:t xml:space="preserve">●  Set price is fixed at creation; it cannot be overridden at the point of sale.</w:t>
-      </w:r>
-    </w:p>
-    <w:p>
-      <w:pPr>
-        <w:spacing w:after="50" w:before="50"/>
-        <w:ind w:left="360"/>
-      </w:pPr>
-      <w:r>
-        <w:rPr>
-          <w:rFonts w:ascii="Arial" w:cs="Arial" w:eastAsia="Arial" w:hAnsi="Arial"/>
-          <w:color w:val="1F497D"/>
-          <w:sz w:val="18"/>
-          <w:szCs w:val="18"/>
-        </w:rPr>
-        <w:t xml:space="preserve">●  Serial number is unique within the branch and cannot be changed after creation.</w:t>
-      </w:r>
-    </w:p>
-    <w:p>
-      <w:pPr>
-        <w:spacing w:after="50" w:before="50"/>
-        <w:ind w:left="360"/>
-      </w:pPr>
-      <w:r>
-        <w:rPr>
-          <w:rFonts w:ascii="Arial" w:cs="Arial" w:eastAsia="Arial" w:hAnsi="Arial"/>
-          <w:color w:val="1F497D"/>
-          <w:sz w:val="18"/>
-          <w:szCs w:val="18"/>
-        </w:rPr>
-        <w:t xml:space="preserve">●  Items are permanently tied to their branch -- no transfers to other branches.</w:t>
-      </w:r>
-    </w:p>
-    <w:p>
-      <w:pPr>
-        <w:spacing w:after="80"/>
-      </w:pPr>
-    </w:p>
-    <w:p>
-      <w:pPr>
-        <w:shd w:fill="FCE4D6" w:val="clear"/>
-        <w:spacing w:after="80" w:before="80"/>
-      </w:pPr>
-      <w:r>
-        <w:rPr>
-          <w:rFonts w:ascii="Arial" w:cs="Arial" w:eastAsia="Arial" w:hAnsi="Arial"/>
-          <w:b/>
-          <w:bCs/>
-          <w:color w:val="843C0C"/>
-          <w:sz w:val="18"/>
-          <w:szCs w:val="18"/>
-        </w:rPr>
-        <w:t xml:space="preserve">  REMOVED: Sets / bundles -- every item is an individual unit. No grouped pricing or set-breaking logic.</w:t>
-      </w:r>
-    </w:p>
-    <w:p>
-      <w:pPr>
-        <w:shd w:fill="FCE4D6" w:val="clear"/>
-        <w:spacing w:after="80" w:before="80"/>
-      </w:pPr>
-      <w:r>
-        <w:rPr>
-          <w:rFonts w:ascii="Arial" w:cs="Arial" w:eastAsia="Arial" w:hAnsi="Arial"/>
-          <w:b/>
-          <w:bCs/>
-          <w:color w:val="843C0C"/>
-          <w:sz w:val="18"/>
-          <w:szCs w:val="18"/>
-        </w:rPr>
-        <w:t xml:space="preserve">  REMOVED: Reservations -- items go directly AVAILABLE -&gt; SOLD. No hold, deposit, or expiry flow.</w:t>
-      </w:r>
-    </w:p>
-    <w:p>
-      <w:pPr>
-        <w:shd w:fill="FCE4D6" w:val="clear"/>
-        <w:spacing w:after="80" w:before="80"/>
-      </w:pPr>
-      <w:r>
-        <w:rPr>
-          <w:rFonts w:ascii="Arial" w:cs="Arial" w:eastAsia="Arial" w:hAnsi="Arial"/>
-          <w:b/>
-          <w:bCs/>
-          <w:color w:val="843C0C"/>
-          <w:sz w:val="18"/>
-          <w:szCs w:val="18"/>
-        </w:rPr>
-        <w:t xml:space="preserve">  REMOVED: Branch transfers -- items never move between branches.</w:t>
+        <w:t xml:space="preserve">The showroom uses a quantity-based stock model. Each item or set is a single product record with a unit count. When a sale is made, the quantity decreases. When it reaches zero the product is marked Out of Stock. Front Desk can restock it at any time by adding new units. This replaces the earlier one-serial-number-per-unit model.</w:t>
       </w:r>
     </w:p>
     <w:p>
@@ -15444,7 +14240,7 @@
           <w:sz w:val="26"/>
           <w:szCs w:val="26"/>
         </w:rPr>
-        <w:t xml:space="preserve">4.2. Selling a Showroom Item (Front Desk)</w:t>
+        <w:t xml:space="preserve">4.1. Adding a Showroom Item or Set (Front Desk)</w:t>
       </w:r>
     </w:p>
     <w:tbl>
@@ -15524,7 +14320,7 @@
                 <w:sz w:val="18"/>
                 <w:szCs w:val="18"/>
               </w:rPr>
-              <w:t xml:space="preserve">Customer wants to purchase an AVAILABLE item on the showroom floor</w:t>
+              <w:t xml:space="preserve">New furniture (or a new batch of units of an existing product) arrives at the showroom</w:t>
             </w:r>
           </w:p>
         </w:tc>
@@ -15656,7 +14452,7 @@
                 <w:sz w:val="18"/>
                 <w:szCs w:val="18"/>
               </w:rPr>
-              <w:t xml:space="preserve">Item status = SOLD; Sale record created; revenue captured for Director reporting</w:t>
+              <w:t xml:space="preserve">Product record created (or restocked) with status = In Stock; searchable; sellable immediately</w:t>
             </w:r>
           </w:p>
         </w:tc>
@@ -15904,7 +14700,7 @@
                 <w:sz w:val="18"/>
                 <w:szCs w:val="18"/>
               </w:rPr>
-              <w:t xml:space="preserve">Opens 'Showroom Stock' tab. Filters by AVAILABLE. Searches by name or SKU. Confirms serial number matches the physical item.</w:t>
+              <w:t xml:space="preserve">Opens 'Showroom' -&gt; 'Inventory' tab. Clicks 'Add item'.</w:t>
             </w:r>
           </w:p>
         </w:tc>
@@ -15936,7 +14732,7 @@
                 <w:sz w:val="18"/>
                 <w:szCs w:val="18"/>
               </w:rPr>
-              <w:t xml:space="preserve">GET /api/shop/items/?branch_id={id} -- returns only this branch items</w:t>
+              <w:t xml:space="preserve">Inventory screen loaded, scoped to this Front Desk's branch</w:t>
             </w:r>
           </w:p>
         </w:tc>
@@ -16034,7 +14830,7 @@
                 <w:sz w:val="18"/>
                 <w:szCs w:val="18"/>
               </w:rPr>
-              <w:t xml:space="preserve">Clicks 'Sell item' on the matching AVAILABLE card</w:t>
+              <w:t xml:space="preserve">At the top of the form, selects the product mode: 'Standalone item' (a single product type, e.g. Coffee Table) or 'Set' (a group of pieces sold together as one unit, e.g. Dining Room Set)</w:t>
             </w:r>
           </w:p>
         </w:tc>
@@ -16066,7 +14862,7 @@
                 <w:sz w:val="18"/>
                 <w:szCs w:val="18"/>
               </w:rPr>
-              <w:t xml:space="preserve">Confirm sale dialog opens: item name, SKU, set price (note: 'price cannot be changed at point of sale')</w:t>
+              <w:t xml:space="preserve">Form fields change slightly depending on mode selected</w:t>
             </w:r>
           </w:p>
         </w:tc>
@@ -16164,7 +14960,7 @@
                 <w:sz w:val="18"/>
                 <w:szCs w:val="18"/>
               </w:rPr>
-              <w:t xml:space="preserve">Clicks 'Confirm sale'</w:t>
+              <w:t xml:space="preserve">Fills in: Name, Room (Dining Room, Bedroom, etc.), Price (TZS, fixed at sale), Units in stock, Photos (JPEG/PNG/WEBP, max 5MB each). Standalone only: Item type (Table, Chair, Sofa, etc.), Category (optional grouping label), Description (materials, dimensions, finish). Set only: 'What's included' -- list of all pieces, e.g. '1x dining table, 6x chairs, 1x sideboard' (required).</w:t>
             </w:r>
           </w:p>
         </w:tc>
@@ -16196,7 +14992,7 @@
                 <w:sz w:val="18"/>
                 <w:szCs w:val="18"/>
               </w:rPr>
-              <w:t xml:space="preserve">POST /api/shop/sales/ -- Sale record created: {item_id, sale_price, sold_by, branch, sold_at}; item.status -&gt; SOLD</w:t>
+              <w:t xml:space="preserve">SKU is auto-generated from room + item type + branch (standalone) or room + branch (sets, since sets have no single item type). A preview of the new listing is shown before submitting.</w:t>
             </w:r>
           </w:p>
         </w:tc>
@@ -16262,6 +15058,136 @@
                 <w:sz w:val="18"/>
                 <w:szCs w:val="18"/>
               </w:rPr>
+              <w:t xml:space="preserve">Front Desk</w:t>
+            </w:r>
+          </w:p>
+        </w:tc>
+        <w:tc>
+          <w:tcPr>
+            <w:tcW w:type="dxa" w:w="3600"/>
+            <w:tcBorders>
+              <w:top w:val="single" w:color="CCCCCC" w:sz="1"/>
+              <w:left w:val="single" w:color="CCCCCC" w:sz="1"/>
+              <w:bottom w:val="single" w:color="CCCCCC" w:sz="1"/>
+              <w:right w:val="single" w:color="CCCCCC" w:sz="1"/>
+            </w:tcBorders>
+            <w:shd w:fill="FFFFFF" w:val="clear"/>
+            <w:tcMar>
+              <w:top w:type="dxa" w:w="80"/>
+              <w:left w:type="dxa" w:w="140"/>
+              <w:bottom w:type="dxa" w:w="80"/>
+              <w:right w:type="dxa" w:w="140"/>
+            </w:tcMar>
+            <w:vAlign w:val="top"/>
+          </w:tcPr>
+          <w:p>
+            <w:r>
+              <w:rPr>
+                <w:rFonts w:ascii="Arial" w:cs="Arial" w:eastAsia="Arial" w:hAnsi="Arial"/>
+                <w:b w:val="false"/>
+                <w:bCs w:val="false"/>
+                <w:color w:val="000000"/>
+                <w:sz w:val="18"/>
+                <w:szCs w:val="18"/>
+              </w:rPr>
+              <w:t xml:space="preserve">Reviews the SKU and listing preview, then clicks 'Add item' / 'Add set'</w:t>
+            </w:r>
+          </w:p>
+        </w:tc>
+        <w:tc>
+          <w:tcPr>
+            <w:tcW w:type="dxa" w:w="3660"/>
+            <w:tcBorders>
+              <w:top w:val="single" w:color="CCCCCC" w:sz="1"/>
+              <w:left w:val="single" w:color="CCCCCC" w:sz="1"/>
+              <w:bottom w:val="single" w:color="CCCCCC" w:sz="1"/>
+              <w:right w:val="single" w:color="CCCCCC" w:sz="1"/>
+            </w:tcBorders>
+            <w:shd w:fill="E2EFDA" w:val="clear"/>
+            <w:tcMar>
+              <w:top w:type="dxa" w:w="80"/>
+              <w:left w:type="dxa" w:w="140"/>
+              <w:bottom w:type="dxa" w:w="80"/>
+              <w:right w:type="dxa" w:w="140"/>
+            </w:tcMar>
+            <w:vAlign w:val="top"/>
+          </w:tcPr>
+          <w:p>
+            <w:r>
+              <w:rPr>
+                <w:rFonts w:ascii="Arial" w:cs="Arial" w:eastAsia="Arial" w:hAnsi="Arial"/>
+                <w:b w:val="false"/>
+                <w:bCs w:val="false"/>
+                <w:color w:val="000000"/>
+                <w:sz w:val="18"/>
+                <w:szCs w:val="18"/>
+              </w:rPr>
+              <w:t xml:space="preserve">POST /api/shop/items/ -- product created with status=In Stock, branch = Front Desk's branch, stock_quantity = units entered</w:t>
+            </w:r>
+          </w:p>
+        </w:tc>
+      </w:tr>
+      <w:tr>
+        <w:tc>
+          <w:tcPr>
+            <w:tcW w:type="dxa" w:w="500"/>
+            <w:tcBorders>
+              <w:top w:val="single" w:color="CCCCCC" w:sz="1"/>
+              <w:left w:val="single" w:color="CCCCCC" w:sz="1"/>
+              <w:bottom w:val="single" w:color="CCCCCC" w:sz="1"/>
+              <w:right w:val="single" w:color="CCCCCC" w:sz="1"/>
+            </w:tcBorders>
+            <w:shd w:fill="F2F2F2" w:val="clear"/>
+            <w:tcMar>
+              <w:top w:type="dxa" w:w="80"/>
+              <w:left w:type="dxa" w:w="140"/>
+              <w:bottom w:type="dxa" w:w="80"/>
+              <w:right w:type="dxa" w:w="140"/>
+            </w:tcMar>
+            <w:vAlign w:val="top"/>
+          </w:tcPr>
+          <w:p>
+            <w:r>
+              <w:rPr>
+                <w:rFonts w:ascii="Arial" w:cs="Arial" w:eastAsia="Arial" w:hAnsi="Arial"/>
+                <w:b/>
+                <w:bCs/>
+                <w:color w:val="000000"/>
+                <w:sz w:val="18"/>
+                <w:szCs w:val="18"/>
+              </w:rPr>
+              <w:t xml:space="preserve">5</w:t>
+            </w:r>
+          </w:p>
+        </w:tc>
+        <w:tc>
+          <w:tcPr>
+            <w:tcW w:type="dxa" w:w="1600"/>
+            <w:tcBorders>
+              <w:top w:val="single" w:color="CCCCCC" w:sz="1"/>
+              <w:left w:val="single" w:color="CCCCCC" w:sz="1"/>
+              <w:bottom w:val="single" w:color="CCCCCC" w:sz="1"/>
+              <w:right w:val="single" w:color="CCCCCC" w:sz="1"/>
+            </w:tcBorders>
+            <w:shd w:fill="D6E4F0" w:val="clear"/>
+            <w:tcMar>
+              <w:top w:type="dxa" w:w="80"/>
+              <w:left w:type="dxa" w:w="140"/>
+              <w:bottom w:type="dxa" w:w="80"/>
+              <w:right w:type="dxa" w:w="140"/>
+            </w:tcMar>
+            <w:vAlign w:val="top"/>
+          </w:tcPr>
+          <w:p>
+            <w:r>
+              <w:rPr>
+                <w:rFonts w:ascii="Arial" w:cs="Arial" w:eastAsia="Arial" w:hAnsi="Arial"/>
+                <w:b w:val="false"/>
+                <w:bCs w:val="false"/>
+                <w:color w:val="000000"/>
+                <w:sz w:val="18"/>
+                <w:szCs w:val="18"/>
+              </w:rPr>
               <w:t xml:space="preserve">System</w:t>
             </w:r>
           </w:p>
@@ -16326,7 +15252,7 @@
                 <w:sz w:val="18"/>
                 <w:szCs w:val="18"/>
               </w:rPr>
-              <w:t xml:space="preserve">Item disappears from the AVAILABLE filter. Appears in SOLD / All filter. Director Revenue -&gt; Showroom Sales tab includes this transaction.</w:t>
+              <w:t xml:space="preserve">Product appears immediately in the Inventory grid as In Stock. Searchable by name or SKU; filterable by room and item type.</w:t>
             </w:r>
           </w:p>
         </w:tc>
@@ -16349,7 +15275,7 @@
           <w:sz w:val="18"/>
           <w:szCs w:val="18"/>
         </w:rPr>
-        <w:t xml:space="preserve">●  Only AVAILABLE items show in the default filter. SOLD items visible via 'Sold' or 'All' filter for reference.</w:t>
+        <w:t xml:space="preserve">●  Price is fixed at creation and cannot be overridden at the point of sale.</w:t>
       </w:r>
     </w:p>
     <w:p>
@@ -16364,7 +15290,2594 @@
           <w:sz w:val="18"/>
           <w:szCs w:val="18"/>
         </w:rPr>
-        <w:t xml:space="preserve">●  The sale price always equals the set price -- Front Desk has no override ability.</w:t>
+        <w:t xml:space="preserve">●  SKU is system-generated -- Front Desk never types it in manually.</w:t>
+      </w:r>
+    </w:p>
+    <w:p>
+      <w:pPr>
+        <w:spacing w:after="50" w:before="50"/>
+        <w:ind w:left="360"/>
+      </w:pPr>
+      <w:r>
+        <w:rPr>
+          <w:rFonts w:ascii="Arial" w:cs="Arial" w:eastAsia="Arial" w:hAnsi="Arial"/>
+          <w:color w:val="1F497D"/>
+          <w:sz w:val="18"/>
+          <w:szCs w:val="18"/>
+        </w:rPr>
+        <w:t xml:space="preserve">●  Multiple physical units of the same product share a single record and a single SKU -- they are not tracked individually.</w:t>
+      </w:r>
+    </w:p>
+    <w:p>
+      <w:pPr>
+        <w:spacing w:after="50" w:before="50"/>
+        <w:ind w:left="360"/>
+      </w:pPr>
+      <w:r>
+        <w:rPr>
+          <w:rFonts w:ascii="Arial" w:cs="Arial" w:eastAsia="Arial" w:hAnsi="Arial"/>
+          <w:color w:val="1F497D"/>
+          <w:sz w:val="18"/>
+          <w:szCs w:val="18"/>
+        </w:rPr>
+        <w:t xml:space="preserve">●  Products are permanently tied to their branch -- no transfers to other branches.</w:t>
+      </w:r>
+    </w:p>
+    <w:p>
+      <w:pPr>
+        <w:spacing w:after="80"/>
+      </w:pPr>
+    </w:p>
+    <w:p>
+      <w:pPr>
+        <w:shd w:fill="FCE4D6" w:val="clear"/>
+        <w:spacing w:after="80" w:before="80"/>
+      </w:pPr>
+      <w:r>
+        <w:rPr>
+          <w:rFonts w:ascii="Arial" w:cs="Arial" w:eastAsia="Arial" w:hAnsi="Arial"/>
+          <w:b/>
+          <w:bCs/>
+          <w:color w:val="843C0C"/>
+          <w:sz w:val="18"/>
+          <w:szCs w:val="18"/>
+        </w:rPr>
+        <w:t xml:space="preserve">  REMOVED: Per-unit serial numbers on showroom stock -- replaced by a simple quantity count on the product record.</w:t>
+      </w:r>
+    </w:p>
+    <w:p>
+      <w:pPr>
+        <w:shd w:fill="FCE4D6" w:val="clear"/>
+        <w:spacing w:after="80" w:before="80"/>
+      </w:pPr>
+      <w:r>
+        <w:rPr>
+          <w:rFonts w:ascii="Arial" w:cs="Arial" w:eastAsia="Arial" w:hAnsi="Arial"/>
+          <w:b/>
+          <w:bCs/>
+          <w:color w:val="843C0C"/>
+          <w:sz w:val="18"/>
+          <w:szCs w:val="18"/>
+        </w:rPr>
+        <w:t xml:space="preserve">  REMOVED: Reservations -- products go directly In Stock -&gt; Out of Stock as quantity depletes. No hold, deposit, or expiry flow.</w:t>
+      </w:r>
+    </w:p>
+    <w:p>
+      <w:pPr>
+        <w:shd w:fill="FCE4D6" w:val="clear"/>
+        <w:spacing w:after="80" w:before="80"/>
+      </w:pPr>
+      <w:r>
+        <w:rPr>
+          <w:rFonts w:ascii="Arial" w:cs="Arial" w:eastAsia="Arial" w:hAnsi="Arial"/>
+          <w:b/>
+          <w:bCs/>
+          <w:color w:val="843C0C"/>
+          <w:sz w:val="18"/>
+          <w:szCs w:val="18"/>
+        </w:rPr>
+        <w:t xml:space="preserve">  REMOVED: Branch transfers -- products never move between branches.</w:t>
+      </w:r>
+    </w:p>
+    <w:p>
+      <w:pPr>
+        <w:spacing w:after="80"/>
+      </w:pPr>
+    </w:p>
+    <w:p>
+      <w:pPr>
+        <w:pBdr>
+          <w:bottom w:val="single" w:color="D9D9D9" w:sz="4"/>
+        </w:pBdr>
+        <w:spacing w:after="200" w:before="200"/>
+      </w:pPr>
+    </w:p>
+    <w:p>
+      <w:pPr>
+        <w:spacing w:after="100" w:before="320"/>
+      </w:pPr>
+      <w:r>
+        <w:rPr>
+          <w:rFonts w:ascii="Arial" w:cs="Arial" w:eastAsia="Arial" w:hAnsi="Arial"/>
+          <w:b/>
+          <w:bCs/>
+          <w:color w:val="1F497D"/>
+          <w:sz w:val="26"/>
+          <w:szCs w:val="26"/>
+        </w:rPr>
+        <w:t xml:space="preserve">4.2. Recording a Sale (Front Desk)</w:t>
+      </w:r>
+    </w:p>
+    <w:tbl>
+      <w:tblPr>
+        <w:tblW w:type="dxa" w:w="9360"/>
+        <w:tblBorders>
+          <w:top w:val="single" w:color="auto" w:sz="4"/>
+          <w:left w:val="single" w:color="auto" w:sz="4"/>
+          <w:bottom w:val="single" w:color="auto" w:sz="4"/>
+          <w:right w:val="single" w:color="auto" w:sz="4"/>
+          <w:insideH w:val="single" w:color="auto" w:sz="4"/>
+          <w:insideV w:val="single" w:color="auto" w:sz="4"/>
+        </w:tblBorders>
+      </w:tblPr>
+      <w:tblGrid>
+        <w:gridCol w:w="2200"/>
+        <w:gridCol w:w="7160"/>
+      </w:tblGrid>
+      <w:tr>
+        <w:tc>
+          <w:tcPr>
+            <w:tcW w:type="dxa" w:w="2200"/>
+            <w:tcBorders>
+              <w:top w:val="single" w:color="CCCCCC" w:sz="1"/>
+              <w:left w:val="single" w:color="CCCCCC" w:sz="1"/>
+              <w:bottom w:val="single" w:color="CCCCCC" w:sz="1"/>
+              <w:right w:val="single" w:color="CCCCCC" w:sz="1"/>
+            </w:tcBorders>
+            <w:shd w:fill="F2F2F2" w:val="clear"/>
+            <w:tcMar>
+              <w:top w:type="dxa" w:w="80"/>
+              <w:left w:type="dxa" w:w="140"/>
+              <w:bottom w:type="dxa" w:w="80"/>
+              <w:right w:type="dxa" w:w="140"/>
+            </w:tcMar>
+            <w:vAlign w:val="top"/>
+          </w:tcPr>
+          <w:p>
+            <w:r>
+              <w:rPr>
+                <w:rFonts w:ascii="Arial" w:cs="Arial" w:eastAsia="Arial" w:hAnsi="Arial"/>
+                <w:b/>
+                <w:bCs/>
+                <w:color w:val="000000"/>
+                <w:sz w:val="18"/>
+                <w:szCs w:val="18"/>
+              </w:rPr>
+              <w:t xml:space="preserve">Trigger</w:t>
+            </w:r>
+          </w:p>
+        </w:tc>
+        <w:tc>
+          <w:tcPr>
+            <w:tcW w:type="dxa" w:w="7160"/>
+            <w:tcBorders>
+              <w:top w:val="single" w:color="CCCCCC" w:sz="1"/>
+              <w:left w:val="single" w:color="CCCCCC" w:sz="1"/>
+              <w:bottom w:val="single" w:color="CCCCCC" w:sz="1"/>
+              <w:right w:val="single" w:color="CCCCCC" w:sz="1"/>
+            </w:tcBorders>
+            <w:shd w:fill="FFFFFF" w:val="clear"/>
+            <w:tcMar>
+              <w:top w:type="dxa" w:w="80"/>
+              <w:left w:type="dxa" w:w="140"/>
+              <w:bottom w:type="dxa" w:w="80"/>
+              <w:right w:type="dxa" w:w="140"/>
+            </w:tcMar>
+            <w:vAlign w:val="top"/>
+          </w:tcPr>
+          <w:p>
+            <w:r>
+              <w:rPr>
+                <w:rFonts w:ascii="Arial" w:cs="Arial" w:eastAsia="Arial" w:hAnsi="Arial"/>
+                <w:b w:val="false"/>
+                <w:bCs w:val="false"/>
+                <w:color w:val="000000"/>
+                <w:sz w:val="18"/>
+                <w:szCs w:val="18"/>
+              </w:rPr>
+              <w:t xml:space="preserve">Customer wants to purchase a standalone item or a set from the showroom floor</w:t>
+            </w:r>
+          </w:p>
+        </w:tc>
+      </w:tr>
+      <w:tr>
+        <w:tc>
+          <w:tcPr>
+            <w:tcW w:type="dxa" w:w="2200"/>
+            <w:tcBorders>
+              <w:top w:val="single" w:color="CCCCCC" w:sz="1"/>
+              <w:left w:val="single" w:color="CCCCCC" w:sz="1"/>
+              <w:bottom w:val="single" w:color="CCCCCC" w:sz="1"/>
+              <w:right w:val="single" w:color="CCCCCC" w:sz="1"/>
+            </w:tcBorders>
+            <w:shd w:fill="F2F2F2" w:val="clear"/>
+            <w:tcMar>
+              <w:top w:type="dxa" w:w="80"/>
+              <w:left w:type="dxa" w:w="140"/>
+              <w:bottom w:type="dxa" w:w="80"/>
+              <w:right w:type="dxa" w:w="140"/>
+            </w:tcMar>
+            <w:vAlign w:val="top"/>
+          </w:tcPr>
+          <w:p>
+            <w:r>
+              <w:rPr>
+                <w:rFonts w:ascii="Arial" w:cs="Arial" w:eastAsia="Arial" w:hAnsi="Arial"/>
+                <w:b/>
+                <w:bCs/>
+                <w:color w:val="000000"/>
+                <w:sz w:val="18"/>
+                <w:szCs w:val="18"/>
+              </w:rPr>
+              <w:t xml:space="preserve">Initiator</w:t>
+            </w:r>
+          </w:p>
+        </w:tc>
+        <w:tc>
+          <w:tcPr>
+            <w:tcW w:type="dxa" w:w="7160"/>
+            <w:tcBorders>
+              <w:top w:val="single" w:color="CCCCCC" w:sz="1"/>
+              <w:left w:val="single" w:color="CCCCCC" w:sz="1"/>
+              <w:bottom w:val="single" w:color="CCCCCC" w:sz="1"/>
+              <w:right w:val="single" w:color="CCCCCC" w:sz="1"/>
+            </w:tcBorders>
+            <w:shd w:fill="FFFFFF" w:val="clear"/>
+            <w:tcMar>
+              <w:top w:type="dxa" w:w="80"/>
+              <w:left w:type="dxa" w:w="140"/>
+              <w:bottom w:type="dxa" w:w="80"/>
+              <w:right w:type="dxa" w:w="140"/>
+            </w:tcMar>
+            <w:vAlign w:val="top"/>
+          </w:tcPr>
+          <w:p>
+            <w:r>
+              <w:rPr>
+                <w:rFonts w:ascii="Arial" w:cs="Arial" w:eastAsia="Arial" w:hAnsi="Arial"/>
+                <w:b w:val="false"/>
+                <w:bCs w:val="false"/>
+                <w:color w:val="000000"/>
+                <w:sz w:val="18"/>
+                <w:szCs w:val="18"/>
+              </w:rPr>
+              <w:t xml:space="preserve">Front Desk</w:t>
+            </w:r>
+          </w:p>
+        </w:tc>
+      </w:tr>
+      <w:tr>
+        <w:tc>
+          <w:tcPr>
+            <w:tcW w:type="dxa" w:w="2200"/>
+            <w:tcBorders>
+              <w:top w:val="single" w:color="CCCCCC" w:sz="1"/>
+              <w:left w:val="single" w:color="CCCCCC" w:sz="1"/>
+              <w:bottom w:val="single" w:color="CCCCCC" w:sz="1"/>
+              <w:right w:val="single" w:color="CCCCCC" w:sz="1"/>
+            </w:tcBorders>
+            <w:shd w:fill="F2F2F2" w:val="clear"/>
+            <w:tcMar>
+              <w:top w:type="dxa" w:w="80"/>
+              <w:left w:type="dxa" w:w="140"/>
+              <w:bottom w:type="dxa" w:w="80"/>
+              <w:right w:type="dxa" w:w="140"/>
+            </w:tcMar>
+            <w:vAlign w:val="top"/>
+          </w:tcPr>
+          <w:p>
+            <w:r>
+              <w:rPr>
+                <w:rFonts w:ascii="Arial" w:cs="Arial" w:eastAsia="Arial" w:hAnsi="Arial"/>
+                <w:b/>
+                <w:bCs/>
+                <w:color w:val="000000"/>
+                <w:sz w:val="18"/>
+                <w:szCs w:val="18"/>
+              </w:rPr>
+              <w:t xml:space="preserve">End State</w:t>
+            </w:r>
+          </w:p>
+        </w:tc>
+        <w:tc>
+          <w:tcPr>
+            <w:tcW w:type="dxa" w:w="7160"/>
+            <w:tcBorders>
+              <w:top w:val="single" w:color="CCCCCC" w:sz="1"/>
+              <w:left w:val="single" w:color="CCCCCC" w:sz="1"/>
+              <w:bottom w:val="single" w:color="CCCCCC" w:sz="1"/>
+              <w:right w:val="single" w:color="CCCCCC" w:sz="1"/>
+            </w:tcBorders>
+            <w:shd w:fill="FFFFFF" w:val="clear"/>
+            <w:tcMar>
+              <w:top w:type="dxa" w:w="80"/>
+              <w:left w:type="dxa" w:w="140"/>
+              <w:bottom w:type="dxa" w:w="80"/>
+              <w:right w:type="dxa" w:w="140"/>
+            </w:tcMar>
+            <w:vAlign w:val="top"/>
+          </w:tcPr>
+          <w:p>
+            <w:r>
+              <w:rPr>
+                <w:rFonts w:ascii="Arial" w:cs="Arial" w:eastAsia="Arial" w:hAnsi="Arial"/>
+                <w:b w:val="false"/>
+                <w:bCs w:val="false"/>
+                <w:color w:val="000000"/>
+                <w:sz w:val="18"/>
+                <w:szCs w:val="18"/>
+              </w:rPr>
+              <w:t xml:space="preserve">Stock quantity decreased; Sale record created; product auto-marked Out of Stock if quantity reaches zero</w:t>
+            </w:r>
+          </w:p>
+        </w:tc>
+      </w:tr>
+    </w:tbl>
+    <w:p>
+      <w:pPr>
+        <w:spacing w:after="80"/>
+      </w:pPr>
+    </w:p>
+    <w:tbl>
+      <w:tblPr>
+        <w:tblW w:type="dxa" w:w="9360"/>
+        <w:tblBorders>
+          <w:top w:val="single" w:color="auto" w:sz="4"/>
+          <w:left w:val="single" w:color="auto" w:sz="4"/>
+          <w:bottom w:val="single" w:color="auto" w:sz="4"/>
+          <w:right w:val="single" w:color="auto" w:sz="4"/>
+          <w:insideH w:val="single" w:color="auto" w:sz="4"/>
+          <w:insideV w:val="single" w:color="auto" w:sz="4"/>
+        </w:tblBorders>
+      </w:tblPr>
+      <w:tblGrid>
+        <w:gridCol w:w="500"/>
+        <w:gridCol w:w="1600"/>
+        <w:gridCol w:w="3600"/>
+        <w:gridCol w:w="3660"/>
+      </w:tblGrid>
+      <w:tr>
+        <w:tc>
+          <w:tcPr>
+            <w:tcW w:type="dxa" w:w="500"/>
+            <w:tcBorders>
+              <w:top w:val="single" w:color="1F497D" w:sz="1"/>
+              <w:left w:val="single" w:color="1F497D" w:sz="1"/>
+              <w:bottom w:val="single" w:color="1F497D" w:sz="1"/>
+              <w:right w:val="single" w:color="1F497D" w:sz="1"/>
+            </w:tcBorders>
+            <w:shd w:fill="1F497D" w:val="clear"/>
+            <w:tcMar>
+              <w:top w:type="dxa" w:w="80"/>
+              <w:left w:type="dxa" w:w="140"/>
+              <w:bottom w:type="dxa" w:w="80"/>
+              <w:right w:type="dxa" w:w="140"/>
+            </w:tcMar>
+          </w:tcPr>
+          <w:p>
+            <w:r>
+              <w:rPr>
+                <w:rFonts w:ascii="Arial" w:cs="Arial" w:eastAsia="Arial" w:hAnsi="Arial"/>
+                <w:b/>
+                <w:bCs/>
+                <w:color w:val="FFFFFF"/>
+                <w:sz w:val="18"/>
+                <w:szCs w:val="18"/>
+              </w:rPr>
+              <w:t xml:space="preserve">#</w:t>
+            </w:r>
+          </w:p>
+        </w:tc>
+        <w:tc>
+          <w:tcPr>
+            <w:tcW w:type="dxa" w:w="1600"/>
+            <w:tcBorders>
+              <w:top w:val="single" w:color="1F497D" w:sz="1"/>
+              <w:left w:val="single" w:color="1F497D" w:sz="1"/>
+              <w:bottom w:val="single" w:color="1F497D" w:sz="1"/>
+              <w:right w:val="single" w:color="1F497D" w:sz="1"/>
+            </w:tcBorders>
+            <w:shd w:fill="1F497D" w:val="clear"/>
+            <w:tcMar>
+              <w:top w:type="dxa" w:w="80"/>
+              <w:left w:type="dxa" w:w="140"/>
+              <w:bottom w:type="dxa" w:w="80"/>
+              <w:right w:type="dxa" w:w="140"/>
+            </w:tcMar>
+          </w:tcPr>
+          <w:p>
+            <w:r>
+              <w:rPr>
+                <w:rFonts w:ascii="Arial" w:cs="Arial" w:eastAsia="Arial" w:hAnsi="Arial"/>
+                <w:b/>
+                <w:bCs/>
+                <w:color w:val="FFFFFF"/>
+                <w:sz w:val="18"/>
+                <w:szCs w:val="18"/>
+              </w:rPr>
+              <w:t xml:space="preserve">Actor</w:t>
+            </w:r>
+          </w:p>
+        </w:tc>
+        <w:tc>
+          <w:tcPr>
+            <w:tcW w:type="dxa" w:w="3600"/>
+            <w:tcBorders>
+              <w:top w:val="single" w:color="1F497D" w:sz="1"/>
+              <w:left w:val="single" w:color="1F497D" w:sz="1"/>
+              <w:bottom w:val="single" w:color="1F497D" w:sz="1"/>
+              <w:right w:val="single" w:color="1F497D" w:sz="1"/>
+            </w:tcBorders>
+            <w:shd w:fill="1F497D" w:val="clear"/>
+            <w:tcMar>
+              <w:top w:type="dxa" w:w="80"/>
+              <w:left w:type="dxa" w:w="140"/>
+              <w:bottom w:type="dxa" w:w="80"/>
+              <w:right w:type="dxa" w:w="140"/>
+            </w:tcMar>
+          </w:tcPr>
+          <w:p>
+            <w:r>
+              <w:rPr>
+                <w:rFonts w:ascii="Arial" w:cs="Arial" w:eastAsia="Arial" w:hAnsi="Arial"/>
+                <w:b/>
+                <w:bCs/>
+                <w:color w:val="FFFFFF"/>
+                <w:sz w:val="18"/>
+                <w:szCs w:val="18"/>
+              </w:rPr>
+              <w:t xml:space="preserve">Action</w:t>
+            </w:r>
+          </w:p>
+        </w:tc>
+        <w:tc>
+          <w:tcPr>
+            <w:tcW w:type="dxa" w:w="3660"/>
+            <w:tcBorders>
+              <w:top w:val="single" w:color="1F497D" w:sz="1"/>
+              <w:left w:val="single" w:color="1F497D" w:sz="1"/>
+              <w:bottom w:val="single" w:color="1F497D" w:sz="1"/>
+              <w:right w:val="single" w:color="1F497D" w:sz="1"/>
+            </w:tcBorders>
+            <w:shd w:fill="1F497D" w:val="clear"/>
+            <w:tcMar>
+              <w:top w:type="dxa" w:w="80"/>
+              <w:left w:type="dxa" w:w="140"/>
+              <w:bottom w:type="dxa" w:w="80"/>
+              <w:right w:type="dxa" w:w="140"/>
+            </w:tcMar>
+          </w:tcPr>
+          <w:p>
+            <w:r>
+              <w:rPr>
+                <w:rFonts w:ascii="Arial" w:cs="Arial" w:eastAsia="Arial" w:hAnsi="Arial"/>
+                <w:b/>
+                <w:bCs/>
+                <w:color w:val="FFFFFF"/>
+                <w:sz w:val="18"/>
+                <w:szCs w:val="18"/>
+              </w:rPr>
+              <w:t xml:space="preserve">System Response</w:t>
+            </w:r>
+          </w:p>
+        </w:tc>
+      </w:tr>
+      <w:tr>
+        <w:tc>
+          <w:tcPr>
+            <w:tcW w:type="dxa" w:w="500"/>
+            <w:tcBorders>
+              <w:top w:val="single" w:color="CCCCCC" w:sz="1"/>
+              <w:left w:val="single" w:color="CCCCCC" w:sz="1"/>
+              <w:bottom w:val="single" w:color="CCCCCC" w:sz="1"/>
+              <w:right w:val="single" w:color="CCCCCC" w:sz="1"/>
+            </w:tcBorders>
+            <w:shd w:fill="F2F2F2" w:val="clear"/>
+            <w:tcMar>
+              <w:top w:type="dxa" w:w="80"/>
+              <w:left w:type="dxa" w:w="140"/>
+              <w:bottom w:type="dxa" w:w="80"/>
+              <w:right w:type="dxa" w:w="140"/>
+            </w:tcMar>
+            <w:vAlign w:val="top"/>
+          </w:tcPr>
+          <w:p>
+            <w:r>
+              <w:rPr>
+                <w:rFonts w:ascii="Arial" w:cs="Arial" w:eastAsia="Arial" w:hAnsi="Arial"/>
+                <w:b/>
+                <w:bCs/>
+                <w:color w:val="000000"/>
+                <w:sz w:val="18"/>
+                <w:szCs w:val="18"/>
+              </w:rPr>
+              <w:t xml:space="preserve">1</w:t>
+            </w:r>
+          </w:p>
+        </w:tc>
+        <w:tc>
+          <w:tcPr>
+            <w:tcW w:type="dxa" w:w="1600"/>
+            <w:tcBorders>
+              <w:top w:val="single" w:color="CCCCCC" w:sz="1"/>
+              <w:left w:val="single" w:color="CCCCCC" w:sz="1"/>
+              <w:bottom w:val="single" w:color="CCCCCC" w:sz="1"/>
+              <w:right w:val="single" w:color="CCCCCC" w:sz="1"/>
+            </w:tcBorders>
+            <w:shd w:fill="D6E4F0" w:val="clear"/>
+            <w:tcMar>
+              <w:top w:type="dxa" w:w="80"/>
+              <w:left w:type="dxa" w:w="140"/>
+              <w:bottom w:type="dxa" w:w="80"/>
+              <w:right w:type="dxa" w:w="140"/>
+            </w:tcMar>
+            <w:vAlign w:val="top"/>
+          </w:tcPr>
+          <w:p>
+            <w:r>
+              <w:rPr>
+                <w:rFonts w:ascii="Arial" w:cs="Arial" w:eastAsia="Arial" w:hAnsi="Arial"/>
+                <w:b w:val="false"/>
+                <w:bCs w:val="false"/>
+                <w:color w:val="000000"/>
+                <w:sz w:val="18"/>
+                <w:szCs w:val="18"/>
+              </w:rPr>
+              <w:t xml:space="preserve">Front Desk</w:t>
+            </w:r>
+          </w:p>
+        </w:tc>
+        <w:tc>
+          <w:tcPr>
+            <w:tcW w:type="dxa" w:w="3600"/>
+            <w:tcBorders>
+              <w:top w:val="single" w:color="CCCCCC" w:sz="1"/>
+              <w:left w:val="single" w:color="CCCCCC" w:sz="1"/>
+              <w:bottom w:val="single" w:color="CCCCCC" w:sz="1"/>
+              <w:right w:val="single" w:color="CCCCCC" w:sz="1"/>
+            </w:tcBorders>
+            <w:shd w:fill="FFFFFF" w:val="clear"/>
+            <w:tcMar>
+              <w:top w:type="dxa" w:w="80"/>
+              <w:left w:type="dxa" w:w="140"/>
+              <w:bottom w:type="dxa" w:w="80"/>
+              <w:right w:type="dxa" w:w="140"/>
+            </w:tcMar>
+            <w:vAlign w:val="top"/>
+          </w:tcPr>
+          <w:p>
+            <w:r>
+              <w:rPr>
+                <w:rFonts w:ascii="Arial" w:cs="Arial" w:eastAsia="Arial" w:hAnsi="Arial"/>
+                <w:b w:val="false"/>
+                <w:bCs w:val="false"/>
+                <w:color w:val="000000"/>
+                <w:sz w:val="18"/>
+                <w:szCs w:val="18"/>
+              </w:rPr>
+              <w:t xml:space="preserve">In the Inventory tab, finds the product using the search bar, or filters by 'In stock'</w:t>
+            </w:r>
+          </w:p>
+        </w:tc>
+        <w:tc>
+          <w:tcPr>
+            <w:tcW w:type="dxa" w:w="3660"/>
+            <w:tcBorders>
+              <w:top w:val="single" w:color="CCCCCC" w:sz="1"/>
+              <w:left w:val="single" w:color="CCCCCC" w:sz="1"/>
+              <w:bottom w:val="single" w:color="CCCCCC" w:sz="1"/>
+              <w:right w:val="single" w:color="CCCCCC" w:sz="1"/>
+            </w:tcBorders>
+            <w:shd w:fill="E2EFDA" w:val="clear"/>
+            <w:tcMar>
+              <w:top w:type="dxa" w:w="80"/>
+              <w:left w:type="dxa" w:w="140"/>
+              <w:bottom w:type="dxa" w:w="80"/>
+              <w:right w:type="dxa" w:w="140"/>
+            </w:tcMar>
+            <w:vAlign w:val="top"/>
+          </w:tcPr>
+          <w:p>
+            <w:r>
+              <w:rPr>
+                <w:rFonts w:ascii="Arial" w:cs="Arial" w:eastAsia="Arial" w:hAnsi="Arial"/>
+                <w:b w:val="false"/>
+                <w:bCs w:val="false"/>
+                <w:color w:val="000000"/>
+                <w:sz w:val="18"/>
+                <w:szCs w:val="18"/>
+              </w:rPr>
+              <w:t xml:space="preserve">GET /api/shop/items/?branch_id={id} -- returns only this branch's products</w:t>
+            </w:r>
+          </w:p>
+        </w:tc>
+      </w:tr>
+      <w:tr>
+        <w:tc>
+          <w:tcPr>
+            <w:tcW w:type="dxa" w:w="500"/>
+            <w:tcBorders>
+              <w:top w:val="single" w:color="CCCCCC" w:sz="1"/>
+              <w:left w:val="single" w:color="CCCCCC" w:sz="1"/>
+              <w:bottom w:val="single" w:color="CCCCCC" w:sz="1"/>
+              <w:right w:val="single" w:color="CCCCCC" w:sz="1"/>
+            </w:tcBorders>
+            <w:shd w:fill="F2F2F2" w:val="clear"/>
+            <w:tcMar>
+              <w:top w:type="dxa" w:w="80"/>
+              <w:left w:type="dxa" w:w="140"/>
+              <w:bottom w:type="dxa" w:w="80"/>
+              <w:right w:type="dxa" w:w="140"/>
+            </w:tcMar>
+            <w:vAlign w:val="top"/>
+          </w:tcPr>
+          <w:p>
+            <w:r>
+              <w:rPr>
+                <w:rFonts w:ascii="Arial" w:cs="Arial" w:eastAsia="Arial" w:hAnsi="Arial"/>
+                <w:b/>
+                <w:bCs/>
+                <w:color w:val="000000"/>
+                <w:sz w:val="18"/>
+                <w:szCs w:val="18"/>
+              </w:rPr>
+              <w:t xml:space="preserve">2</w:t>
+            </w:r>
+          </w:p>
+        </w:tc>
+        <w:tc>
+          <w:tcPr>
+            <w:tcW w:type="dxa" w:w="1600"/>
+            <w:tcBorders>
+              <w:top w:val="single" w:color="CCCCCC" w:sz="1"/>
+              <w:left w:val="single" w:color="CCCCCC" w:sz="1"/>
+              <w:bottom w:val="single" w:color="CCCCCC" w:sz="1"/>
+              <w:right w:val="single" w:color="CCCCCC" w:sz="1"/>
+            </w:tcBorders>
+            <w:shd w:fill="D6E4F0" w:val="clear"/>
+            <w:tcMar>
+              <w:top w:type="dxa" w:w="80"/>
+              <w:left w:type="dxa" w:w="140"/>
+              <w:bottom w:type="dxa" w:w="80"/>
+              <w:right w:type="dxa" w:w="140"/>
+            </w:tcMar>
+            <w:vAlign w:val="top"/>
+          </w:tcPr>
+          <w:p>
+            <w:r>
+              <w:rPr>
+                <w:rFonts w:ascii="Arial" w:cs="Arial" w:eastAsia="Arial" w:hAnsi="Arial"/>
+                <w:b w:val="false"/>
+                <w:bCs w:val="false"/>
+                <w:color w:val="000000"/>
+                <w:sz w:val="18"/>
+                <w:szCs w:val="18"/>
+              </w:rPr>
+              <w:t xml:space="preserve">Front Desk</w:t>
+            </w:r>
+          </w:p>
+        </w:tc>
+        <w:tc>
+          <w:tcPr>
+            <w:tcW w:type="dxa" w:w="3600"/>
+            <w:tcBorders>
+              <w:top w:val="single" w:color="CCCCCC" w:sz="1"/>
+              <w:left w:val="single" w:color="CCCCCC" w:sz="1"/>
+              <w:bottom w:val="single" w:color="CCCCCC" w:sz="1"/>
+              <w:right w:val="single" w:color="CCCCCC" w:sz="1"/>
+            </w:tcBorders>
+            <w:shd w:fill="FFFFFF" w:val="clear"/>
+            <w:tcMar>
+              <w:top w:type="dxa" w:w="80"/>
+              <w:left w:type="dxa" w:w="140"/>
+              <w:bottom w:type="dxa" w:w="80"/>
+              <w:right w:type="dxa" w:w="140"/>
+            </w:tcMar>
+            <w:vAlign w:val="top"/>
+          </w:tcPr>
+          <w:p>
+            <w:r>
+              <w:rPr>
+                <w:rFonts w:ascii="Arial" w:cs="Arial" w:eastAsia="Arial" w:hAnsi="Arial"/>
+                <w:b w:val="false"/>
+                <w:bCs w:val="false"/>
+                <w:color w:val="000000"/>
+                <w:sz w:val="18"/>
+                <w:szCs w:val="18"/>
+              </w:rPr>
+              <w:t xml:space="preserve">Clicks the product card to open the full preview, or clicks 'Sell item' directly on the card</w:t>
+            </w:r>
+          </w:p>
+        </w:tc>
+        <w:tc>
+          <w:tcPr>
+            <w:tcW w:type="dxa" w:w="3660"/>
+            <w:tcBorders>
+              <w:top w:val="single" w:color="CCCCCC" w:sz="1"/>
+              <w:left w:val="single" w:color="CCCCCC" w:sz="1"/>
+              <w:bottom w:val="single" w:color="CCCCCC" w:sz="1"/>
+              <w:right w:val="single" w:color="CCCCCC" w:sz="1"/>
+            </w:tcBorders>
+            <w:shd w:fill="E2EFDA" w:val="clear"/>
+            <w:tcMar>
+              <w:top w:type="dxa" w:w="80"/>
+              <w:left w:type="dxa" w:w="140"/>
+              <w:bottom w:type="dxa" w:w="80"/>
+              <w:right w:type="dxa" w:w="140"/>
+            </w:tcMar>
+            <w:vAlign w:val="top"/>
+          </w:tcPr>
+          <w:p>
+            <w:r>
+              <w:rPr>
+                <w:rFonts w:ascii="Arial" w:cs="Arial" w:eastAsia="Arial" w:hAnsi="Arial"/>
+                <w:b w:val="false"/>
+                <w:bCs w:val="false"/>
+                <w:color w:val="000000"/>
+                <w:sz w:val="18"/>
+                <w:szCs w:val="18"/>
+              </w:rPr>
+              <w:t xml:space="preserve">Preview shows images (click any thumbnail to view full-screen), SKU, branch, category, price, description or set contents, and current stock status</w:t>
+            </w:r>
+          </w:p>
+        </w:tc>
+      </w:tr>
+      <w:tr>
+        <w:tc>
+          <w:tcPr>
+            <w:tcW w:type="dxa" w:w="500"/>
+            <w:tcBorders>
+              <w:top w:val="single" w:color="CCCCCC" w:sz="1"/>
+              <w:left w:val="single" w:color="CCCCCC" w:sz="1"/>
+              <w:bottom w:val="single" w:color="CCCCCC" w:sz="1"/>
+              <w:right w:val="single" w:color="CCCCCC" w:sz="1"/>
+            </w:tcBorders>
+            <w:shd w:fill="F2F2F2" w:val="clear"/>
+            <w:tcMar>
+              <w:top w:type="dxa" w:w="80"/>
+              <w:left w:type="dxa" w:w="140"/>
+              <w:bottom w:type="dxa" w:w="80"/>
+              <w:right w:type="dxa" w:w="140"/>
+            </w:tcMar>
+            <w:vAlign w:val="top"/>
+          </w:tcPr>
+          <w:p>
+            <w:r>
+              <w:rPr>
+                <w:rFonts w:ascii="Arial" w:cs="Arial" w:eastAsia="Arial" w:hAnsi="Arial"/>
+                <w:b/>
+                <w:bCs/>
+                <w:color w:val="000000"/>
+                <w:sz w:val="18"/>
+                <w:szCs w:val="18"/>
+              </w:rPr>
+              <w:t xml:space="preserve">3</w:t>
+            </w:r>
+          </w:p>
+        </w:tc>
+        <w:tc>
+          <w:tcPr>
+            <w:tcW w:type="dxa" w:w="1600"/>
+            <w:tcBorders>
+              <w:top w:val="single" w:color="CCCCCC" w:sz="1"/>
+              <w:left w:val="single" w:color="CCCCCC" w:sz="1"/>
+              <w:bottom w:val="single" w:color="CCCCCC" w:sz="1"/>
+              <w:right w:val="single" w:color="CCCCCC" w:sz="1"/>
+            </w:tcBorders>
+            <w:shd w:fill="D6E4F0" w:val="clear"/>
+            <w:tcMar>
+              <w:top w:type="dxa" w:w="80"/>
+              <w:left w:type="dxa" w:w="140"/>
+              <w:bottom w:type="dxa" w:w="80"/>
+              <w:right w:type="dxa" w:w="140"/>
+            </w:tcMar>
+            <w:vAlign w:val="top"/>
+          </w:tcPr>
+          <w:p>
+            <w:r>
+              <w:rPr>
+                <w:rFonts w:ascii="Arial" w:cs="Arial" w:eastAsia="Arial" w:hAnsi="Arial"/>
+                <w:b w:val="false"/>
+                <w:bCs w:val="false"/>
+                <w:color w:val="000000"/>
+                <w:sz w:val="18"/>
+                <w:szCs w:val="18"/>
+              </w:rPr>
+              <w:t xml:space="preserve">Front Desk</w:t>
+            </w:r>
+          </w:p>
+        </w:tc>
+        <w:tc>
+          <w:tcPr>
+            <w:tcW w:type="dxa" w:w="3600"/>
+            <w:tcBorders>
+              <w:top w:val="single" w:color="CCCCCC" w:sz="1"/>
+              <w:left w:val="single" w:color="CCCCCC" w:sz="1"/>
+              <w:bottom w:val="single" w:color="CCCCCC" w:sz="1"/>
+              <w:right w:val="single" w:color="CCCCCC" w:sz="1"/>
+            </w:tcBorders>
+            <w:shd w:fill="FFFFFF" w:val="clear"/>
+            <w:tcMar>
+              <w:top w:type="dxa" w:w="80"/>
+              <w:left w:type="dxa" w:w="140"/>
+              <w:bottom w:type="dxa" w:w="80"/>
+              <w:right w:type="dxa" w:w="140"/>
+            </w:tcMar>
+            <w:vAlign w:val="top"/>
+          </w:tcPr>
+          <w:p>
+            <w:r>
+              <w:rPr>
+                <w:rFonts w:ascii="Arial" w:cs="Arial" w:eastAsia="Arial" w:hAnsi="Arial"/>
+                <w:b w:val="false"/>
+                <w:bCs w:val="false"/>
+                <w:color w:val="000000"/>
+                <w:sz w:val="18"/>
+                <w:szCs w:val="18"/>
+              </w:rPr>
+              <w:t xml:space="preserve">Clicks 'Sell item' / 'Sell set'</w:t>
+            </w:r>
+          </w:p>
+        </w:tc>
+        <w:tc>
+          <w:tcPr>
+            <w:tcW w:type="dxa" w:w="3660"/>
+            <w:tcBorders>
+              <w:top w:val="single" w:color="CCCCCC" w:sz="1"/>
+              <w:left w:val="single" w:color="CCCCCC" w:sz="1"/>
+              <w:bottom w:val="single" w:color="CCCCCC" w:sz="1"/>
+              <w:right w:val="single" w:color="CCCCCC" w:sz="1"/>
+            </w:tcBorders>
+            <w:shd w:fill="E2EFDA" w:val="clear"/>
+            <w:tcMar>
+              <w:top w:type="dxa" w:w="80"/>
+              <w:left w:type="dxa" w:w="140"/>
+              <w:bottom w:type="dxa" w:w="80"/>
+              <w:right w:type="dxa" w:w="140"/>
+            </w:tcMar>
+            <w:vAlign w:val="top"/>
+          </w:tcPr>
+          <w:p>
+            <w:r>
+              <w:rPr>
+                <w:rFonts w:ascii="Arial" w:cs="Arial" w:eastAsia="Arial" w:hAnsi="Arial"/>
+                <w:b w:val="false"/>
+                <w:bCs w:val="false"/>
+                <w:color w:val="000000"/>
+                <w:sz w:val="18"/>
+                <w:szCs w:val="18"/>
+              </w:rPr>
+              <w:t xml:space="preserve">Sale form opens</w:t>
+            </w:r>
+          </w:p>
+        </w:tc>
+      </w:tr>
+      <w:tr>
+        <w:tc>
+          <w:tcPr>
+            <w:tcW w:type="dxa" w:w="500"/>
+            <w:tcBorders>
+              <w:top w:val="single" w:color="CCCCCC" w:sz="1"/>
+              <w:left w:val="single" w:color="CCCCCC" w:sz="1"/>
+              <w:bottom w:val="single" w:color="CCCCCC" w:sz="1"/>
+              <w:right w:val="single" w:color="CCCCCC" w:sz="1"/>
+            </w:tcBorders>
+            <w:shd w:fill="F2F2F2" w:val="clear"/>
+            <w:tcMar>
+              <w:top w:type="dxa" w:w="80"/>
+              <w:left w:type="dxa" w:w="140"/>
+              <w:bottom w:type="dxa" w:w="80"/>
+              <w:right w:type="dxa" w:w="140"/>
+            </w:tcMar>
+            <w:vAlign w:val="top"/>
+          </w:tcPr>
+          <w:p>
+            <w:r>
+              <w:rPr>
+                <w:rFonts w:ascii="Arial" w:cs="Arial" w:eastAsia="Arial" w:hAnsi="Arial"/>
+                <w:b/>
+                <w:bCs/>
+                <w:color w:val="000000"/>
+                <w:sz w:val="18"/>
+                <w:szCs w:val="18"/>
+              </w:rPr>
+              <w:t xml:space="preserve">4a</w:t>
+            </w:r>
+          </w:p>
+        </w:tc>
+        <w:tc>
+          <w:tcPr>
+            <w:tcW w:type="dxa" w:w="1600"/>
+            <w:tcBorders>
+              <w:top w:val="single" w:color="CCCCCC" w:sz="1"/>
+              <w:left w:val="single" w:color="CCCCCC" w:sz="1"/>
+              <w:bottom w:val="single" w:color="CCCCCC" w:sz="1"/>
+              <w:right w:val="single" w:color="CCCCCC" w:sz="1"/>
+            </w:tcBorders>
+            <w:shd w:fill="D6E4F0" w:val="clear"/>
+            <w:tcMar>
+              <w:top w:type="dxa" w:w="80"/>
+              <w:left w:type="dxa" w:w="140"/>
+              <w:bottom w:type="dxa" w:w="80"/>
+              <w:right w:type="dxa" w:w="140"/>
+            </w:tcMar>
+            <w:vAlign w:val="top"/>
+          </w:tcPr>
+          <w:p>
+            <w:r>
+              <w:rPr>
+                <w:rFonts w:ascii="Arial" w:cs="Arial" w:eastAsia="Arial" w:hAnsi="Arial"/>
+                <w:b w:val="false"/>
+                <w:bCs w:val="false"/>
+                <w:color w:val="000000"/>
+                <w:sz w:val="18"/>
+                <w:szCs w:val="18"/>
+              </w:rPr>
+              <w:t xml:space="preserve">Front Desk</w:t>
+            </w:r>
+          </w:p>
+        </w:tc>
+        <w:tc>
+          <w:tcPr>
+            <w:tcW w:type="dxa" w:w="3600"/>
+            <w:tcBorders>
+              <w:top w:val="single" w:color="CCCCCC" w:sz="1"/>
+              <w:left w:val="single" w:color="CCCCCC" w:sz="1"/>
+              <w:bottom w:val="single" w:color="CCCCCC" w:sz="1"/>
+              <w:right w:val="single" w:color="CCCCCC" w:sz="1"/>
+            </w:tcBorders>
+            <w:shd w:fill="FFFFFF" w:val="clear"/>
+            <w:tcMar>
+              <w:top w:type="dxa" w:w="80"/>
+              <w:left w:type="dxa" w:w="140"/>
+              <w:bottom w:type="dxa" w:w="80"/>
+              <w:right w:type="dxa" w:w="140"/>
+            </w:tcMar>
+            <w:vAlign w:val="top"/>
+          </w:tcPr>
+          <w:p>
+            <w:r>
+              <w:rPr>
+                <w:rFonts w:ascii="Arial" w:cs="Arial" w:eastAsia="Arial" w:hAnsi="Arial"/>
+                <w:b w:val="false"/>
+                <w:bCs w:val="false"/>
+                <w:color w:val="000000"/>
+                <w:sz w:val="18"/>
+                <w:szCs w:val="18"/>
+              </w:rPr>
+              <w:t xml:space="preserve">Standalone item: enters Units to sell (default 1). Remaining stock after the sale is shown before confirming.</w:t>
+            </w:r>
+          </w:p>
+        </w:tc>
+        <w:tc>
+          <w:tcPr>
+            <w:tcW w:type="dxa" w:w="3660"/>
+            <w:tcBorders>
+              <w:top w:val="single" w:color="CCCCCC" w:sz="1"/>
+              <w:left w:val="single" w:color="CCCCCC" w:sz="1"/>
+              <w:bottom w:val="single" w:color="CCCCCC" w:sz="1"/>
+              <w:right w:val="single" w:color="CCCCCC" w:sz="1"/>
+            </w:tcBorders>
+            <w:shd w:fill="E2EFDA" w:val="clear"/>
+            <w:tcMar>
+              <w:top w:type="dxa" w:w="80"/>
+              <w:left w:type="dxa" w:w="140"/>
+              <w:bottom w:type="dxa" w:w="80"/>
+              <w:right w:type="dxa" w:w="140"/>
+            </w:tcMar>
+            <w:vAlign w:val="top"/>
+          </w:tcPr>
+          <w:p>
+            <w:r>
+              <w:rPr>
+                <w:rFonts w:ascii="Arial" w:cs="Arial" w:eastAsia="Arial" w:hAnsi="Arial"/>
+                <w:b w:val="false"/>
+                <w:bCs w:val="false"/>
+                <w:color w:val="000000"/>
+                <w:sz w:val="18"/>
+                <w:szCs w:val="18"/>
+              </w:rPr>
+              <w:t xml:space="preserve">System validates units-to-sell does not exceed current stock_quantity; rejects with an error if it does</w:t>
+            </w:r>
+          </w:p>
+        </w:tc>
+      </w:tr>
+      <w:tr>
+        <w:tc>
+          <w:tcPr>
+            <w:tcW w:type="dxa" w:w="500"/>
+            <w:tcBorders>
+              <w:top w:val="single" w:color="CCCCCC" w:sz="1"/>
+              <w:left w:val="single" w:color="CCCCCC" w:sz="1"/>
+              <w:bottom w:val="single" w:color="CCCCCC" w:sz="1"/>
+              <w:right w:val="single" w:color="CCCCCC" w:sz="1"/>
+            </w:tcBorders>
+            <w:shd w:fill="F2F2F2" w:val="clear"/>
+            <w:tcMar>
+              <w:top w:type="dxa" w:w="80"/>
+              <w:left w:type="dxa" w:w="140"/>
+              <w:bottom w:type="dxa" w:w="80"/>
+              <w:right w:type="dxa" w:w="140"/>
+            </w:tcMar>
+            <w:vAlign w:val="top"/>
+          </w:tcPr>
+          <w:p>
+            <w:r>
+              <w:rPr>
+                <w:rFonts w:ascii="Arial" w:cs="Arial" w:eastAsia="Arial" w:hAnsi="Arial"/>
+                <w:b/>
+                <w:bCs/>
+                <w:color w:val="000000"/>
+                <w:sz w:val="18"/>
+                <w:szCs w:val="18"/>
+              </w:rPr>
+              <w:t xml:space="preserve">4b</w:t>
+            </w:r>
+          </w:p>
+        </w:tc>
+        <w:tc>
+          <w:tcPr>
+            <w:tcW w:type="dxa" w:w="1600"/>
+            <w:tcBorders>
+              <w:top w:val="single" w:color="CCCCCC" w:sz="1"/>
+              <w:left w:val="single" w:color="CCCCCC" w:sz="1"/>
+              <w:bottom w:val="single" w:color="CCCCCC" w:sz="1"/>
+              <w:right w:val="single" w:color="CCCCCC" w:sz="1"/>
+            </w:tcBorders>
+            <w:shd w:fill="D6E4F0" w:val="clear"/>
+            <w:tcMar>
+              <w:top w:type="dxa" w:w="80"/>
+              <w:left w:type="dxa" w:w="140"/>
+              <w:bottom w:type="dxa" w:w="80"/>
+              <w:right w:type="dxa" w:w="140"/>
+            </w:tcMar>
+            <w:vAlign w:val="top"/>
+          </w:tcPr>
+          <w:p>
+            <w:r>
+              <w:rPr>
+                <w:rFonts w:ascii="Arial" w:cs="Arial" w:eastAsia="Arial" w:hAnsi="Arial"/>
+                <w:b w:val="false"/>
+                <w:bCs w:val="false"/>
+                <w:color w:val="000000"/>
+                <w:sz w:val="18"/>
+                <w:szCs w:val="18"/>
+              </w:rPr>
+              <w:t xml:space="preserve">Front Desk</w:t>
+            </w:r>
+          </w:p>
+        </w:tc>
+        <w:tc>
+          <w:tcPr>
+            <w:tcW w:type="dxa" w:w="3600"/>
+            <w:tcBorders>
+              <w:top w:val="single" w:color="CCCCCC" w:sz="1"/>
+              <w:left w:val="single" w:color="CCCCCC" w:sz="1"/>
+              <w:bottom w:val="single" w:color="CCCCCC" w:sz="1"/>
+              <w:right w:val="single" w:color="CCCCCC" w:sz="1"/>
+            </w:tcBorders>
+            <w:shd w:fill="FFFFFF" w:val="clear"/>
+            <w:tcMar>
+              <w:top w:type="dxa" w:w="80"/>
+              <w:left w:type="dxa" w:w="140"/>
+              <w:bottom w:type="dxa" w:w="80"/>
+              <w:right w:type="dxa" w:w="140"/>
+            </w:tcMar>
+            <w:vAlign w:val="top"/>
+          </w:tcPr>
+          <w:p>
+            <w:r>
+              <w:rPr>
+                <w:rFonts w:ascii="Arial" w:cs="Arial" w:eastAsia="Arial" w:hAnsi="Arial"/>
+                <w:b w:val="false"/>
+                <w:bCs w:val="false"/>
+                <w:color w:val="000000"/>
+                <w:sz w:val="18"/>
+                <w:szCs w:val="18"/>
+              </w:rPr>
+              <w:t xml:space="preserve">Set: quantity sold is fixed at 1 -- sets are sold as a whole unit and cannot be split</w:t>
+            </w:r>
+          </w:p>
+        </w:tc>
+        <w:tc>
+          <w:tcPr>
+            <w:tcW w:type="dxa" w:w="3660"/>
+            <w:tcBorders>
+              <w:top w:val="single" w:color="CCCCCC" w:sz="1"/>
+              <w:left w:val="single" w:color="CCCCCC" w:sz="1"/>
+              <w:bottom w:val="single" w:color="CCCCCC" w:sz="1"/>
+              <w:right w:val="single" w:color="CCCCCC" w:sz="1"/>
+            </w:tcBorders>
+            <w:shd w:fill="E2EFDA" w:val="clear"/>
+            <w:tcMar>
+              <w:top w:type="dxa" w:w="80"/>
+              <w:left w:type="dxa" w:w="140"/>
+              <w:bottom w:type="dxa" w:w="80"/>
+              <w:right w:type="dxa" w:w="140"/>
+            </w:tcMar>
+            <w:vAlign w:val="top"/>
+          </w:tcPr>
+          <w:p>
+            <w:r>
+              <w:rPr>
+                <w:rFonts w:ascii="Arial" w:cs="Arial" w:eastAsia="Arial" w:hAnsi="Arial"/>
+                <w:b w:val="false"/>
+                <w:bCs w:val="false"/>
+                <w:color w:val="000000"/>
+                <w:sz w:val="18"/>
+                <w:szCs w:val="18"/>
+              </w:rPr>
+              <w:t xml:space="preserve">Quantity field is locked to 1 for sets</w:t>
+            </w:r>
+          </w:p>
+        </w:tc>
+      </w:tr>
+      <w:tr>
+        <w:tc>
+          <w:tcPr>
+            <w:tcW w:type="dxa" w:w="500"/>
+            <w:tcBorders>
+              <w:top w:val="single" w:color="CCCCCC" w:sz="1"/>
+              <w:left w:val="single" w:color="CCCCCC" w:sz="1"/>
+              <w:bottom w:val="single" w:color="CCCCCC" w:sz="1"/>
+              <w:right w:val="single" w:color="CCCCCC" w:sz="1"/>
+            </w:tcBorders>
+            <w:shd w:fill="F2F2F2" w:val="clear"/>
+            <w:tcMar>
+              <w:top w:type="dxa" w:w="80"/>
+              <w:left w:type="dxa" w:w="140"/>
+              <w:bottom w:type="dxa" w:w="80"/>
+              <w:right w:type="dxa" w:w="140"/>
+            </w:tcMar>
+            <w:vAlign w:val="top"/>
+          </w:tcPr>
+          <w:p>
+            <w:r>
+              <w:rPr>
+                <w:rFonts w:ascii="Arial" w:cs="Arial" w:eastAsia="Arial" w:hAnsi="Arial"/>
+                <w:b/>
+                <w:bCs/>
+                <w:color w:val="000000"/>
+                <w:sz w:val="18"/>
+                <w:szCs w:val="18"/>
+              </w:rPr>
+              <w:t xml:space="preserve">5</w:t>
+            </w:r>
+          </w:p>
+        </w:tc>
+        <w:tc>
+          <w:tcPr>
+            <w:tcW w:type="dxa" w:w="1600"/>
+            <w:tcBorders>
+              <w:top w:val="single" w:color="CCCCCC" w:sz="1"/>
+              <w:left w:val="single" w:color="CCCCCC" w:sz="1"/>
+              <w:bottom w:val="single" w:color="CCCCCC" w:sz="1"/>
+              <w:right w:val="single" w:color="CCCCCC" w:sz="1"/>
+            </w:tcBorders>
+            <w:shd w:fill="D6E4F0" w:val="clear"/>
+            <w:tcMar>
+              <w:top w:type="dxa" w:w="80"/>
+              <w:left w:type="dxa" w:w="140"/>
+              <w:bottom w:type="dxa" w:w="80"/>
+              <w:right w:type="dxa" w:w="140"/>
+            </w:tcMar>
+            <w:vAlign w:val="top"/>
+          </w:tcPr>
+          <w:p>
+            <w:r>
+              <w:rPr>
+                <w:rFonts w:ascii="Arial" w:cs="Arial" w:eastAsia="Arial" w:hAnsi="Arial"/>
+                <w:b w:val="false"/>
+                <w:bCs w:val="false"/>
+                <w:color w:val="000000"/>
+                <w:sz w:val="18"/>
+                <w:szCs w:val="18"/>
+              </w:rPr>
+              <w:t xml:space="preserve">Front Desk</w:t>
+            </w:r>
+          </w:p>
+        </w:tc>
+        <w:tc>
+          <w:tcPr>
+            <w:tcW w:type="dxa" w:w="3600"/>
+            <w:tcBorders>
+              <w:top w:val="single" w:color="CCCCCC" w:sz="1"/>
+              <w:left w:val="single" w:color="CCCCCC" w:sz="1"/>
+              <w:bottom w:val="single" w:color="CCCCCC" w:sz="1"/>
+              <w:right w:val="single" w:color="CCCCCC" w:sz="1"/>
+            </w:tcBorders>
+            <w:shd w:fill="FFFFFF" w:val="clear"/>
+            <w:tcMar>
+              <w:top w:type="dxa" w:w="80"/>
+              <w:left w:type="dxa" w:w="140"/>
+              <w:bottom w:type="dxa" w:w="80"/>
+              <w:right w:type="dxa" w:w="140"/>
+            </w:tcMar>
+            <w:vAlign w:val="top"/>
+          </w:tcPr>
+          <w:p>
+            <w:r>
+              <w:rPr>
+                <w:rFonts w:ascii="Arial" w:cs="Arial" w:eastAsia="Arial" w:hAnsi="Arial"/>
+                <w:b w:val="false"/>
+                <w:bCs w:val="false"/>
+                <w:color w:val="000000"/>
+                <w:sz w:val="18"/>
+                <w:szCs w:val="18"/>
+              </w:rPr>
+              <w:t xml:space="preserve">Clicks 'Confirm sale'</w:t>
+            </w:r>
+          </w:p>
+        </w:tc>
+        <w:tc>
+          <w:tcPr>
+            <w:tcW w:type="dxa" w:w="3660"/>
+            <w:tcBorders>
+              <w:top w:val="single" w:color="CCCCCC" w:sz="1"/>
+              <w:left w:val="single" w:color="CCCCCC" w:sz="1"/>
+              <w:bottom w:val="single" w:color="CCCCCC" w:sz="1"/>
+              <w:right w:val="single" w:color="CCCCCC" w:sz="1"/>
+            </w:tcBorders>
+            <w:shd w:fill="E2EFDA" w:val="clear"/>
+            <w:tcMar>
+              <w:top w:type="dxa" w:w="80"/>
+              <w:left w:type="dxa" w:w="140"/>
+              <w:bottom w:type="dxa" w:w="80"/>
+              <w:right w:type="dxa" w:w="140"/>
+            </w:tcMar>
+            <w:vAlign w:val="top"/>
+          </w:tcPr>
+          <w:p>
+            <w:r>
+              <w:rPr>
+                <w:rFonts w:ascii="Arial" w:cs="Arial" w:eastAsia="Arial" w:hAnsi="Arial"/>
+                <w:b w:val="false"/>
+                <w:bCs w:val="false"/>
+                <w:color w:val="000000"/>
+                <w:sz w:val="18"/>
+                <w:szCs w:val="18"/>
+              </w:rPr>
+              <w:t xml:space="preserve">POST /api/shop/sales/ -- Sale record created {item_id, units_sold, sale_price, sold_by, branch, sold_at}; stock_quantity decremented atomically</w:t>
+            </w:r>
+          </w:p>
+        </w:tc>
+      </w:tr>
+      <w:tr>
+        <w:tc>
+          <w:tcPr>
+            <w:tcW w:type="dxa" w:w="500"/>
+            <w:tcBorders>
+              <w:top w:val="single" w:color="CCCCCC" w:sz="1"/>
+              <w:left w:val="single" w:color="CCCCCC" w:sz="1"/>
+              <w:bottom w:val="single" w:color="CCCCCC" w:sz="1"/>
+              <w:right w:val="single" w:color="CCCCCC" w:sz="1"/>
+            </w:tcBorders>
+            <w:shd w:fill="F2F2F2" w:val="clear"/>
+            <w:tcMar>
+              <w:top w:type="dxa" w:w="80"/>
+              <w:left w:type="dxa" w:w="140"/>
+              <w:bottom w:type="dxa" w:w="80"/>
+              <w:right w:type="dxa" w:w="140"/>
+            </w:tcMar>
+            <w:vAlign w:val="top"/>
+          </w:tcPr>
+          <w:p>
+            <w:r>
+              <w:rPr>
+                <w:rFonts w:ascii="Arial" w:cs="Arial" w:eastAsia="Arial" w:hAnsi="Arial"/>
+                <w:b/>
+                <w:bCs/>
+                <w:color w:val="000000"/>
+                <w:sz w:val="18"/>
+                <w:szCs w:val="18"/>
+              </w:rPr>
+              <w:t xml:space="preserve">6</w:t>
+            </w:r>
+          </w:p>
+        </w:tc>
+        <w:tc>
+          <w:tcPr>
+            <w:tcW w:type="dxa" w:w="1600"/>
+            <w:tcBorders>
+              <w:top w:val="single" w:color="CCCCCC" w:sz="1"/>
+              <w:left w:val="single" w:color="CCCCCC" w:sz="1"/>
+              <w:bottom w:val="single" w:color="CCCCCC" w:sz="1"/>
+              <w:right w:val="single" w:color="CCCCCC" w:sz="1"/>
+            </w:tcBorders>
+            <w:shd w:fill="D6E4F0" w:val="clear"/>
+            <w:tcMar>
+              <w:top w:type="dxa" w:w="80"/>
+              <w:left w:type="dxa" w:w="140"/>
+              <w:bottom w:type="dxa" w:w="80"/>
+              <w:right w:type="dxa" w:w="140"/>
+            </w:tcMar>
+            <w:vAlign w:val="top"/>
+          </w:tcPr>
+          <w:p>
+            <w:r>
+              <w:rPr>
+                <w:rFonts w:ascii="Arial" w:cs="Arial" w:eastAsia="Arial" w:hAnsi="Arial"/>
+                <w:b w:val="false"/>
+                <w:bCs w:val="false"/>
+                <w:color w:val="000000"/>
+                <w:sz w:val="18"/>
+                <w:szCs w:val="18"/>
+              </w:rPr>
+              <w:t xml:space="preserve">System</w:t>
+            </w:r>
+          </w:p>
+        </w:tc>
+        <w:tc>
+          <w:tcPr>
+            <w:tcW w:type="dxa" w:w="3600"/>
+            <w:tcBorders>
+              <w:top w:val="single" w:color="CCCCCC" w:sz="1"/>
+              <w:left w:val="single" w:color="CCCCCC" w:sz="1"/>
+              <w:bottom w:val="single" w:color="CCCCCC" w:sz="1"/>
+              <w:right w:val="single" w:color="CCCCCC" w:sz="1"/>
+            </w:tcBorders>
+            <w:shd w:fill="FFFFFF" w:val="clear"/>
+            <w:tcMar>
+              <w:top w:type="dxa" w:w="80"/>
+              <w:left w:type="dxa" w:w="140"/>
+              <w:bottom w:type="dxa" w:w="80"/>
+              <w:right w:type="dxa" w:w="140"/>
+            </w:tcMar>
+            <w:vAlign w:val="top"/>
+          </w:tcPr>
+          <w:p>
+            <w:r>
+              <w:rPr>
+                <w:rFonts w:ascii="Arial" w:cs="Arial" w:eastAsia="Arial" w:hAnsi="Arial"/>
+                <w:b w:val="false"/>
+                <w:bCs w:val="false"/>
+                <w:color w:val="000000"/>
+                <w:sz w:val="18"/>
+                <w:szCs w:val="18"/>
+              </w:rPr>
+              <w:t xml:space="preserve">—</w:t>
+            </w:r>
+          </w:p>
+        </w:tc>
+        <w:tc>
+          <w:tcPr>
+            <w:tcW w:type="dxa" w:w="3660"/>
+            <w:tcBorders>
+              <w:top w:val="single" w:color="CCCCCC" w:sz="1"/>
+              <w:left w:val="single" w:color="CCCCCC" w:sz="1"/>
+              <w:bottom w:val="single" w:color="CCCCCC" w:sz="1"/>
+              <w:right w:val="single" w:color="CCCCCC" w:sz="1"/>
+            </w:tcBorders>
+            <w:shd w:fill="E2EFDA" w:val="clear"/>
+            <w:tcMar>
+              <w:top w:type="dxa" w:w="80"/>
+              <w:left w:type="dxa" w:w="140"/>
+              <w:bottom w:type="dxa" w:w="80"/>
+              <w:right w:type="dxa" w:w="140"/>
+            </w:tcMar>
+            <w:vAlign w:val="top"/>
+          </w:tcPr>
+          <w:p>
+            <w:r>
+              <w:rPr>
+                <w:rFonts w:ascii="Arial" w:cs="Arial" w:eastAsia="Arial" w:hAnsi="Arial"/>
+                <w:b w:val="false"/>
+                <w:bCs w:val="false"/>
+                <w:color w:val="000000"/>
+                <w:sz w:val="18"/>
+                <w:szCs w:val="18"/>
+              </w:rPr>
+              <w:t xml:space="preserve">If stock_quantity reaches zero, product status automatically -&gt; Out of Stock. Director Revenue -&gt; Showroom Sales tab includes this transaction.</w:t>
+            </w:r>
+          </w:p>
+        </w:tc>
+      </w:tr>
+    </w:tbl>
+    <w:p>
+      <w:pPr>
+        <w:spacing w:after="80"/>
+      </w:pPr>
+    </w:p>
+    <w:p>
+      <w:pPr>
+        <w:spacing w:after="50" w:before="50"/>
+        <w:ind w:left="360"/>
+      </w:pPr>
+      <w:r>
+        <w:rPr>
+          <w:rFonts w:ascii="Arial" w:cs="Arial" w:eastAsia="Arial" w:hAnsi="Arial"/>
+          <w:color w:val="1F497D"/>
+          <w:sz w:val="18"/>
+          <w:szCs w:val="18"/>
+        </w:rPr>
+        <w:t xml:space="preserve">●  The sale price always equals the fixed listing price -- Front Desk has no override ability at point of sale.</w:t>
+      </w:r>
+    </w:p>
+    <w:p>
+      <w:pPr>
+        <w:spacing w:after="50" w:before="50"/>
+        <w:ind w:left="360"/>
+      </w:pPr>
+      <w:r>
+        <w:rPr>
+          <w:rFonts w:ascii="Arial" w:cs="Arial" w:eastAsia="Arial" w:hAnsi="Arial"/>
+          <w:color w:val="1F497D"/>
+          <w:sz w:val="18"/>
+          <w:szCs w:val="18"/>
+        </w:rPr>
+        <w:t xml:space="preserve">●  A sale that would take stock below zero is rejected by the system before it is recorded.</w:t>
+      </w:r>
+    </w:p>
+    <w:p>
+      <w:pPr>
+        <w:spacing w:after="80"/>
+      </w:pPr>
+    </w:p>
+    <w:p>
+      <w:pPr>
+        <w:pBdr>
+          <w:bottom w:val="single" w:color="D9D9D9" w:sz="4"/>
+        </w:pBdr>
+        <w:spacing w:after="200" w:before="200"/>
+      </w:pPr>
+    </w:p>
+    <w:p>
+      <w:pPr>
+        <w:spacing w:after="100" w:before="320"/>
+      </w:pPr>
+      <w:r>
+        <w:rPr>
+          <w:rFonts w:ascii="Arial" w:cs="Arial" w:eastAsia="Arial" w:hAnsi="Arial"/>
+          <w:b/>
+          <w:bCs/>
+          <w:color w:val="1F497D"/>
+          <w:sz w:val="26"/>
+          <w:szCs w:val="26"/>
+        </w:rPr>
+        <w:t xml:space="preserve">4.3. Restocking an Item or Set (Front Desk)</w:t>
+      </w:r>
+    </w:p>
+    <w:tbl>
+      <w:tblPr>
+        <w:tblW w:type="dxa" w:w="9360"/>
+        <w:tblBorders>
+          <w:top w:val="single" w:color="auto" w:sz="4"/>
+          <w:left w:val="single" w:color="auto" w:sz="4"/>
+          <w:bottom w:val="single" w:color="auto" w:sz="4"/>
+          <w:right w:val="single" w:color="auto" w:sz="4"/>
+          <w:insideH w:val="single" w:color="auto" w:sz="4"/>
+          <w:insideV w:val="single" w:color="auto" w:sz="4"/>
+        </w:tblBorders>
+      </w:tblPr>
+      <w:tblGrid>
+        <w:gridCol w:w="2200"/>
+        <w:gridCol w:w="7160"/>
+      </w:tblGrid>
+      <w:tr>
+        <w:tc>
+          <w:tcPr>
+            <w:tcW w:type="dxa" w:w="2200"/>
+            <w:tcBorders>
+              <w:top w:val="single" w:color="CCCCCC" w:sz="1"/>
+              <w:left w:val="single" w:color="CCCCCC" w:sz="1"/>
+              <w:bottom w:val="single" w:color="CCCCCC" w:sz="1"/>
+              <w:right w:val="single" w:color="CCCCCC" w:sz="1"/>
+            </w:tcBorders>
+            <w:shd w:fill="F2F2F2" w:val="clear"/>
+            <w:tcMar>
+              <w:top w:type="dxa" w:w="80"/>
+              <w:left w:type="dxa" w:w="140"/>
+              <w:bottom w:type="dxa" w:w="80"/>
+              <w:right w:type="dxa" w:w="140"/>
+            </w:tcMar>
+            <w:vAlign w:val="top"/>
+          </w:tcPr>
+          <w:p>
+            <w:r>
+              <w:rPr>
+                <w:rFonts w:ascii="Arial" w:cs="Arial" w:eastAsia="Arial" w:hAnsi="Arial"/>
+                <w:b/>
+                <w:bCs/>
+                <w:color w:val="000000"/>
+                <w:sz w:val="18"/>
+                <w:szCs w:val="18"/>
+              </w:rPr>
+              <w:t xml:space="preserve">Trigger</w:t>
+            </w:r>
+          </w:p>
+        </w:tc>
+        <w:tc>
+          <w:tcPr>
+            <w:tcW w:type="dxa" w:w="7160"/>
+            <w:tcBorders>
+              <w:top w:val="single" w:color="CCCCCC" w:sz="1"/>
+              <w:left w:val="single" w:color="CCCCCC" w:sz="1"/>
+              <w:bottom w:val="single" w:color="CCCCCC" w:sz="1"/>
+              <w:right w:val="single" w:color="CCCCCC" w:sz="1"/>
+            </w:tcBorders>
+            <w:shd w:fill="FFFFFF" w:val="clear"/>
+            <w:tcMar>
+              <w:top w:type="dxa" w:w="80"/>
+              <w:left w:type="dxa" w:w="140"/>
+              <w:bottom w:type="dxa" w:w="80"/>
+              <w:right w:type="dxa" w:w="140"/>
+            </w:tcMar>
+            <w:vAlign w:val="top"/>
+          </w:tcPr>
+          <w:p>
+            <w:r>
+              <w:rPr>
+                <w:rFonts w:ascii="Arial" w:cs="Arial" w:eastAsia="Arial" w:hAnsi="Arial"/>
+                <w:b w:val="false"/>
+                <w:bCs w:val="false"/>
+                <w:color w:val="000000"/>
+                <w:sz w:val="18"/>
+                <w:szCs w:val="18"/>
+              </w:rPr>
+              <w:t xml:space="preserve">More units of an existing product arrive at the showroom (whether currently Out of Stock or still In Stock)</w:t>
+            </w:r>
+          </w:p>
+        </w:tc>
+      </w:tr>
+      <w:tr>
+        <w:tc>
+          <w:tcPr>
+            <w:tcW w:type="dxa" w:w="2200"/>
+            <w:tcBorders>
+              <w:top w:val="single" w:color="CCCCCC" w:sz="1"/>
+              <w:left w:val="single" w:color="CCCCCC" w:sz="1"/>
+              <w:bottom w:val="single" w:color="CCCCCC" w:sz="1"/>
+              <w:right w:val="single" w:color="CCCCCC" w:sz="1"/>
+            </w:tcBorders>
+            <w:shd w:fill="F2F2F2" w:val="clear"/>
+            <w:tcMar>
+              <w:top w:type="dxa" w:w="80"/>
+              <w:left w:type="dxa" w:w="140"/>
+              <w:bottom w:type="dxa" w:w="80"/>
+              <w:right w:type="dxa" w:w="140"/>
+            </w:tcMar>
+            <w:vAlign w:val="top"/>
+          </w:tcPr>
+          <w:p>
+            <w:r>
+              <w:rPr>
+                <w:rFonts w:ascii="Arial" w:cs="Arial" w:eastAsia="Arial" w:hAnsi="Arial"/>
+                <w:b/>
+                <w:bCs/>
+                <w:color w:val="000000"/>
+                <w:sz w:val="18"/>
+                <w:szCs w:val="18"/>
+              </w:rPr>
+              <w:t xml:space="preserve">Initiator</w:t>
+            </w:r>
+          </w:p>
+        </w:tc>
+        <w:tc>
+          <w:tcPr>
+            <w:tcW w:type="dxa" w:w="7160"/>
+            <w:tcBorders>
+              <w:top w:val="single" w:color="CCCCCC" w:sz="1"/>
+              <w:left w:val="single" w:color="CCCCCC" w:sz="1"/>
+              <w:bottom w:val="single" w:color="CCCCCC" w:sz="1"/>
+              <w:right w:val="single" w:color="CCCCCC" w:sz="1"/>
+            </w:tcBorders>
+            <w:shd w:fill="FFFFFF" w:val="clear"/>
+            <w:tcMar>
+              <w:top w:type="dxa" w:w="80"/>
+              <w:left w:type="dxa" w:w="140"/>
+              <w:bottom w:type="dxa" w:w="80"/>
+              <w:right w:type="dxa" w:w="140"/>
+            </w:tcMar>
+            <w:vAlign w:val="top"/>
+          </w:tcPr>
+          <w:p>
+            <w:r>
+              <w:rPr>
+                <w:rFonts w:ascii="Arial" w:cs="Arial" w:eastAsia="Arial" w:hAnsi="Arial"/>
+                <w:b w:val="false"/>
+                <w:bCs w:val="false"/>
+                <w:color w:val="000000"/>
+                <w:sz w:val="18"/>
+                <w:szCs w:val="18"/>
+              </w:rPr>
+              <w:t xml:space="preserve">Front Desk</w:t>
+            </w:r>
+          </w:p>
+        </w:tc>
+      </w:tr>
+      <w:tr>
+        <w:tc>
+          <w:tcPr>
+            <w:tcW w:type="dxa" w:w="2200"/>
+            <w:tcBorders>
+              <w:top w:val="single" w:color="CCCCCC" w:sz="1"/>
+              <w:left w:val="single" w:color="CCCCCC" w:sz="1"/>
+              <w:bottom w:val="single" w:color="CCCCCC" w:sz="1"/>
+              <w:right w:val="single" w:color="CCCCCC" w:sz="1"/>
+            </w:tcBorders>
+            <w:shd w:fill="F2F2F2" w:val="clear"/>
+            <w:tcMar>
+              <w:top w:type="dxa" w:w="80"/>
+              <w:left w:type="dxa" w:w="140"/>
+              <w:bottom w:type="dxa" w:w="80"/>
+              <w:right w:type="dxa" w:w="140"/>
+            </w:tcMar>
+            <w:vAlign w:val="top"/>
+          </w:tcPr>
+          <w:p>
+            <w:r>
+              <w:rPr>
+                <w:rFonts w:ascii="Arial" w:cs="Arial" w:eastAsia="Arial" w:hAnsi="Arial"/>
+                <w:b/>
+                <w:bCs/>
+                <w:color w:val="000000"/>
+                <w:sz w:val="18"/>
+                <w:szCs w:val="18"/>
+              </w:rPr>
+              <w:t xml:space="preserve">End State</w:t>
+            </w:r>
+          </w:p>
+        </w:tc>
+        <w:tc>
+          <w:tcPr>
+            <w:tcW w:type="dxa" w:w="7160"/>
+            <w:tcBorders>
+              <w:top w:val="single" w:color="CCCCCC" w:sz="1"/>
+              <w:left w:val="single" w:color="CCCCCC" w:sz="1"/>
+              <w:bottom w:val="single" w:color="CCCCCC" w:sz="1"/>
+              <w:right w:val="single" w:color="CCCCCC" w:sz="1"/>
+            </w:tcBorders>
+            <w:shd w:fill="FFFFFF" w:val="clear"/>
+            <w:tcMar>
+              <w:top w:type="dxa" w:w="80"/>
+              <w:left w:type="dxa" w:w="140"/>
+              <w:bottom w:type="dxa" w:w="80"/>
+              <w:right w:type="dxa" w:w="140"/>
+            </w:tcMar>
+            <w:vAlign w:val="top"/>
+          </w:tcPr>
+          <w:p>
+            <w:r>
+              <w:rPr>
+                <w:rFonts w:ascii="Arial" w:cs="Arial" w:eastAsia="Arial" w:hAnsi="Arial"/>
+                <w:b w:val="false"/>
+                <w:bCs w:val="false"/>
+                <w:color w:val="000000"/>
+                <w:sz w:val="18"/>
+                <w:szCs w:val="18"/>
+              </w:rPr>
+              <w:t xml:space="preserve">Stock quantity increased; status returns to (or remains) In Stock</w:t>
+            </w:r>
+          </w:p>
+        </w:tc>
+      </w:tr>
+    </w:tbl>
+    <w:p>
+      <w:pPr>
+        <w:spacing w:after="80"/>
+      </w:pPr>
+    </w:p>
+    <w:tbl>
+      <w:tblPr>
+        <w:tblW w:type="dxa" w:w="9360"/>
+        <w:tblBorders>
+          <w:top w:val="single" w:color="auto" w:sz="4"/>
+          <w:left w:val="single" w:color="auto" w:sz="4"/>
+          <w:bottom w:val="single" w:color="auto" w:sz="4"/>
+          <w:right w:val="single" w:color="auto" w:sz="4"/>
+          <w:insideH w:val="single" w:color="auto" w:sz="4"/>
+          <w:insideV w:val="single" w:color="auto" w:sz="4"/>
+        </w:tblBorders>
+      </w:tblPr>
+      <w:tblGrid>
+        <w:gridCol w:w="500"/>
+        <w:gridCol w:w="1600"/>
+        <w:gridCol w:w="3600"/>
+        <w:gridCol w:w="3660"/>
+      </w:tblGrid>
+      <w:tr>
+        <w:tc>
+          <w:tcPr>
+            <w:tcW w:type="dxa" w:w="500"/>
+            <w:tcBorders>
+              <w:top w:val="single" w:color="1F497D" w:sz="1"/>
+              <w:left w:val="single" w:color="1F497D" w:sz="1"/>
+              <w:bottom w:val="single" w:color="1F497D" w:sz="1"/>
+              <w:right w:val="single" w:color="1F497D" w:sz="1"/>
+            </w:tcBorders>
+            <w:shd w:fill="1F497D" w:val="clear"/>
+            <w:tcMar>
+              <w:top w:type="dxa" w:w="80"/>
+              <w:left w:type="dxa" w:w="140"/>
+              <w:bottom w:type="dxa" w:w="80"/>
+              <w:right w:type="dxa" w:w="140"/>
+            </w:tcMar>
+          </w:tcPr>
+          <w:p>
+            <w:r>
+              <w:rPr>
+                <w:rFonts w:ascii="Arial" w:cs="Arial" w:eastAsia="Arial" w:hAnsi="Arial"/>
+                <w:b/>
+                <w:bCs/>
+                <w:color w:val="FFFFFF"/>
+                <w:sz w:val="18"/>
+                <w:szCs w:val="18"/>
+              </w:rPr>
+              <w:t xml:space="preserve">#</w:t>
+            </w:r>
+          </w:p>
+        </w:tc>
+        <w:tc>
+          <w:tcPr>
+            <w:tcW w:type="dxa" w:w="1600"/>
+            <w:tcBorders>
+              <w:top w:val="single" w:color="1F497D" w:sz="1"/>
+              <w:left w:val="single" w:color="1F497D" w:sz="1"/>
+              <w:bottom w:val="single" w:color="1F497D" w:sz="1"/>
+              <w:right w:val="single" w:color="1F497D" w:sz="1"/>
+            </w:tcBorders>
+            <w:shd w:fill="1F497D" w:val="clear"/>
+            <w:tcMar>
+              <w:top w:type="dxa" w:w="80"/>
+              <w:left w:type="dxa" w:w="140"/>
+              <w:bottom w:type="dxa" w:w="80"/>
+              <w:right w:type="dxa" w:w="140"/>
+            </w:tcMar>
+          </w:tcPr>
+          <w:p>
+            <w:r>
+              <w:rPr>
+                <w:rFonts w:ascii="Arial" w:cs="Arial" w:eastAsia="Arial" w:hAnsi="Arial"/>
+                <w:b/>
+                <w:bCs/>
+                <w:color w:val="FFFFFF"/>
+                <w:sz w:val="18"/>
+                <w:szCs w:val="18"/>
+              </w:rPr>
+              <w:t xml:space="preserve">Actor</w:t>
+            </w:r>
+          </w:p>
+        </w:tc>
+        <w:tc>
+          <w:tcPr>
+            <w:tcW w:type="dxa" w:w="3600"/>
+            <w:tcBorders>
+              <w:top w:val="single" w:color="1F497D" w:sz="1"/>
+              <w:left w:val="single" w:color="1F497D" w:sz="1"/>
+              <w:bottom w:val="single" w:color="1F497D" w:sz="1"/>
+              <w:right w:val="single" w:color="1F497D" w:sz="1"/>
+            </w:tcBorders>
+            <w:shd w:fill="1F497D" w:val="clear"/>
+            <w:tcMar>
+              <w:top w:type="dxa" w:w="80"/>
+              <w:left w:type="dxa" w:w="140"/>
+              <w:bottom w:type="dxa" w:w="80"/>
+              <w:right w:type="dxa" w:w="140"/>
+            </w:tcMar>
+          </w:tcPr>
+          <w:p>
+            <w:r>
+              <w:rPr>
+                <w:rFonts w:ascii="Arial" w:cs="Arial" w:eastAsia="Arial" w:hAnsi="Arial"/>
+                <w:b/>
+                <w:bCs/>
+                <w:color w:val="FFFFFF"/>
+                <w:sz w:val="18"/>
+                <w:szCs w:val="18"/>
+              </w:rPr>
+              <w:t xml:space="preserve">Action</w:t>
+            </w:r>
+          </w:p>
+        </w:tc>
+        <w:tc>
+          <w:tcPr>
+            <w:tcW w:type="dxa" w:w="3660"/>
+            <w:tcBorders>
+              <w:top w:val="single" w:color="1F497D" w:sz="1"/>
+              <w:left w:val="single" w:color="1F497D" w:sz="1"/>
+              <w:bottom w:val="single" w:color="1F497D" w:sz="1"/>
+              <w:right w:val="single" w:color="1F497D" w:sz="1"/>
+            </w:tcBorders>
+            <w:shd w:fill="1F497D" w:val="clear"/>
+            <w:tcMar>
+              <w:top w:type="dxa" w:w="80"/>
+              <w:left w:type="dxa" w:w="140"/>
+              <w:bottom w:type="dxa" w:w="80"/>
+              <w:right w:type="dxa" w:w="140"/>
+            </w:tcMar>
+          </w:tcPr>
+          <w:p>
+            <w:r>
+              <w:rPr>
+                <w:rFonts w:ascii="Arial" w:cs="Arial" w:eastAsia="Arial" w:hAnsi="Arial"/>
+                <w:b/>
+                <w:bCs/>
+                <w:color w:val="FFFFFF"/>
+                <w:sz w:val="18"/>
+                <w:szCs w:val="18"/>
+              </w:rPr>
+              <w:t xml:space="preserve">System Response</w:t>
+            </w:r>
+          </w:p>
+        </w:tc>
+      </w:tr>
+      <w:tr>
+        <w:tc>
+          <w:tcPr>
+            <w:tcW w:type="dxa" w:w="500"/>
+            <w:tcBorders>
+              <w:top w:val="single" w:color="CCCCCC" w:sz="1"/>
+              <w:left w:val="single" w:color="CCCCCC" w:sz="1"/>
+              <w:bottom w:val="single" w:color="CCCCCC" w:sz="1"/>
+              <w:right w:val="single" w:color="CCCCCC" w:sz="1"/>
+            </w:tcBorders>
+            <w:shd w:fill="F2F2F2" w:val="clear"/>
+            <w:tcMar>
+              <w:top w:type="dxa" w:w="80"/>
+              <w:left w:type="dxa" w:w="140"/>
+              <w:bottom w:type="dxa" w:w="80"/>
+              <w:right w:type="dxa" w:w="140"/>
+            </w:tcMar>
+            <w:vAlign w:val="top"/>
+          </w:tcPr>
+          <w:p>
+            <w:r>
+              <w:rPr>
+                <w:rFonts w:ascii="Arial" w:cs="Arial" w:eastAsia="Arial" w:hAnsi="Arial"/>
+                <w:b/>
+                <w:bCs/>
+                <w:color w:val="000000"/>
+                <w:sz w:val="18"/>
+                <w:szCs w:val="18"/>
+              </w:rPr>
+              <w:t xml:space="preserve">1</w:t>
+            </w:r>
+          </w:p>
+        </w:tc>
+        <w:tc>
+          <w:tcPr>
+            <w:tcW w:type="dxa" w:w="1600"/>
+            <w:tcBorders>
+              <w:top w:val="single" w:color="CCCCCC" w:sz="1"/>
+              <w:left w:val="single" w:color="CCCCCC" w:sz="1"/>
+              <w:bottom w:val="single" w:color="CCCCCC" w:sz="1"/>
+              <w:right w:val="single" w:color="CCCCCC" w:sz="1"/>
+            </w:tcBorders>
+            <w:shd w:fill="D6E4F0" w:val="clear"/>
+            <w:tcMar>
+              <w:top w:type="dxa" w:w="80"/>
+              <w:left w:type="dxa" w:w="140"/>
+              <w:bottom w:type="dxa" w:w="80"/>
+              <w:right w:type="dxa" w:w="140"/>
+            </w:tcMar>
+            <w:vAlign w:val="top"/>
+          </w:tcPr>
+          <w:p>
+            <w:r>
+              <w:rPr>
+                <w:rFonts w:ascii="Arial" w:cs="Arial" w:eastAsia="Arial" w:hAnsi="Arial"/>
+                <w:b w:val="false"/>
+                <w:bCs w:val="false"/>
+                <w:color w:val="000000"/>
+                <w:sz w:val="18"/>
+                <w:szCs w:val="18"/>
+              </w:rPr>
+              <w:t xml:space="preserve">Front Desk</w:t>
+            </w:r>
+          </w:p>
+        </w:tc>
+        <w:tc>
+          <w:tcPr>
+            <w:tcW w:type="dxa" w:w="3600"/>
+            <w:tcBorders>
+              <w:top w:val="single" w:color="CCCCCC" w:sz="1"/>
+              <w:left w:val="single" w:color="CCCCCC" w:sz="1"/>
+              <w:bottom w:val="single" w:color="CCCCCC" w:sz="1"/>
+              <w:right w:val="single" w:color="CCCCCC" w:sz="1"/>
+            </w:tcBorders>
+            <w:shd w:fill="FFFFFF" w:val="clear"/>
+            <w:tcMar>
+              <w:top w:type="dxa" w:w="80"/>
+              <w:left w:type="dxa" w:w="140"/>
+              <w:bottom w:type="dxa" w:w="80"/>
+              <w:right w:type="dxa" w:w="140"/>
+            </w:tcMar>
+            <w:vAlign w:val="top"/>
+          </w:tcPr>
+          <w:p>
+            <w:r>
+              <w:rPr>
+                <w:rFonts w:ascii="Arial" w:cs="Arial" w:eastAsia="Arial" w:hAnsi="Arial"/>
+                <w:b w:val="false"/>
+                <w:bCs w:val="false"/>
+                <w:color w:val="000000"/>
+                <w:sz w:val="18"/>
+                <w:szCs w:val="18"/>
+              </w:rPr>
+              <w:t xml:space="preserve">In the Inventory tab, filters by 'Out of stock' or searches for the product directly (restocking is not limited to zero-stock items)</w:t>
+            </w:r>
+          </w:p>
+        </w:tc>
+        <w:tc>
+          <w:tcPr>
+            <w:tcW w:type="dxa" w:w="3660"/>
+            <w:tcBorders>
+              <w:top w:val="single" w:color="CCCCCC" w:sz="1"/>
+              <w:left w:val="single" w:color="CCCCCC" w:sz="1"/>
+              <w:bottom w:val="single" w:color="CCCCCC" w:sz="1"/>
+              <w:right w:val="single" w:color="CCCCCC" w:sz="1"/>
+            </w:tcBorders>
+            <w:shd w:fill="E2EFDA" w:val="clear"/>
+            <w:tcMar>
+              <w:top w:type="dxa" w:w="80"/>
+              <w:left w:type="dxa" w:w="140"/>
+              <w:bottom w:type="dxa" w:w="80"/>
+              <w:right w:type="dxa" w:w="140"/>
+            </w:tcMar>
+            <w:vAlign w:val="top"/>
+          </w:tcPr>
+          <w:p>
+            <w:r>
+              <w:rPr>
+                <w:rFonts w:ascii="Arial" w:cs="Arial" w:eastAsia="Arial" w:hAnsi="Arial"/>
+                <w:b w:val="false"/>
+                <w:bCs w:val="false"/>
+                <w:color w:val="000000"/>
+                <w:sz w:val="18"/>
+                <w:szCs w:val="18"/>
+              </w:rPr>
+              <w:t xml:space="preserve">—</w:t>
+            </w:r>
+          </w:p>
+        </w:tc>
+      </w:tr>
+      <w:tr>
+        <w:tc>
+          <w:tcPr>
+            <w:tcW w:type="dxa" w:w="500"/>
+            <w:tcBorders>
+              <w:top w:val="single" w:color="CCCCCC" w:sz="1"/>
+              <w:left w:val="single" w:color="CCCCCC" w:sz="1"/>
+              <w:bottom w:val="single" w:color="CCCCCC" w:sz="1"/>
+              <w:right w:val="single" w:color="CCCCCC" w:sz="1"/>
+            </w:tcBorders>
+            <w:shd w:fill="F2F2F2" w:val="clear"/>
+            <w:tcMar>
+              <w:top w:type="dxa" w:w="80"/>
+              <w:left w:type="dxa" w:w="140"/>
+              <w:bottom w:type="dxa" w:w="80"/>
+              <w:right w:type="dxa" w:w="140"/>
+            </w:tcMar>
+            <w:vAlign w:val="top"/>
+          </w:tcPr>
+          <w:p>
+            <w:r>
+              <w:rPr>
+                <w:rFonts w:ascii="Arial" w:cs="Arial" w:eastAsia="Arial" w:hAnsi="Arial"/>
+                <w:b/>
+                <w:bCs/>
+                <w:color w:val="000000"/>
+                <w:sz w:val="18"/>
+                <w:szCs w:val="18"/>
+              </w:rPr>
+              <w:t xml:space="preserve">2</w:t>
+            </w:r>
+          </w:p>
+        </w:tc>
+        <w:tc>
+          <w:tcPr>
+            <w:tcW w:type="dxa" w:w="1600"/>
+            <w:tcBorders>
+              <w:top w:val="single" w:color="CCCCCC" w:sz="1"/>
+              <w:left w:val="single" w:color="CCCCCC" w:sz="1"/>
+              <w:bottom w:val="single" w:color="CCCCCC" w:sz="1"/>
+              <w:right w:val="single" w:color="CCCCCC" w:sz="1"/>
+            </w:tcBorders>
+            <w:shd w:fill="D6E4F0" w:val="clear"/>
+            <w:tcMar>
+              <w:top w:type="dxa" w:w="80"/>
+              <w:left w:type="dxa" w:w="140"/>
+              <w:bottom w:type="dxa" w:w="80"/>
+              <w:right w:type="dxa" w:w="140"/>
+            </w:tcMar>
+            <w:vAlign w:val="top"/>
+          </w:tcPr>
+          <w:p>
+            <w:r>
+              <w:rPr>
+                <w:rFonts w:ascii="Arial" w:cs="Arial" w:eastAsia="Arial" w:hAnsi="Arial"/>
+                <w:b w:val="false"/>
+                <w:bCs w:val="false"/>
+                <w:color w:val="000000"/>
+                <w:sz w:val="18"/>
+                <w:szCs w:val="18"/>
+              </w:rPr>
+              <w:t xml:space="preserve">Front Desk</w:t>
+            </w:r>
+          </w:p>
+        </w:tc>
+        <w:tc>
+          <w:tcPr>
+            <w:tcW w:type="dxa" w:w="3600"/>
+            <w:tcBorders>
+              <w:top w:val="single" w:color="CCCCCC" w:sz="1"/>
+              <w:left w:val="single" w:color="CCCCCC" w:sz="1"/>
+              <w:bottom w:val="single" w:color="CCCCCC" w:sz="1"/>
+              <w:right w:val="single" w:color="CCCCCC" w:sz="1"/>
+            </w:tcBorders>
+            <w:shd w:fill="FFFFFF" w:val="clear"/>
+            <w:tcMar>
+              <w:top w:type="dxa" w:w="80"/>
+              <w:left w:type="dxa" w:w="140"/>
+              <w:bottom w:type="dxa" w:w="80"/>
+              <w:right w:type="dxa" w:w="140"/>
+            </w:tcMar>
+            <w:vAlign w:val="top"/>
+          </w:tcPr>
+          <w:p>
+            <w:r>
+              <w:rPr>
+                <w:rFonts w:ascii="Arial" w:cs="Arial" w:eastAsia="Arial" w:hAnsi="Arial"/>
+                <w:b w:val="false"/>
+                <w:bCs w:val="false"/>
+                <w:color w:val="000000"/>
+                <w:sz w:val="18"/>
+                <w:szCs w:val="18"/>
+              </w:rPr>
+              <w:t xml:space="preserve">Clicks 'Restock' on the product card, or opens the preview and clicks 'Restock'</w:t>
+            </w:r>
+          </w:p>
+        </w:tc>
+        <w:tc>
+          <w:tcPr>
+            <w:tcW w:type="dxa" w:w="3660"/>
+            <w:tcBorders>
+              <w:top w:val="single" w:color="CCCCCC" w:sz="1"/>
+              <w:left w:val="single" w:color="CCCCCC" w:sz="1"/>
+              <w:bottom w:val="single" w:color="CCCCCC" w:sz="1"/>
+              <w:right w:val="single" w:color="CCCCCC" w:sz="1"/>
+            </w:tcBorders>
+            <w:shd w:fill="E2EFDA" w:val="clear"/>
+            <w:tcMar>
+              <w:top w:type="dxa" w:w="80"/>
+              <w:left w:type="dxa" w:w="140"/>
+              <w:bottom w:type="dxa" w:w="80"/>
+              <w:right w:type="dxa" w:w="140"/>
+            </w:tcMar>
+            <w:vAlign w:val="top"/>
+          </w:tcPr>
+          <w:p>
+            <w:r>
+              <w:rPr>
+                <w:rFonts w:ascii="Arial" w:cs="Arial" w:eastAsia="Arial" w:hAnsi="Arial"/>
+                <w:b w:val="false"/>
+                <w:bCs w:val="false"/>
+                <w:color w:val="000000"/>
+                <w:sz w:val="18"/>
+                <w:szCs w:val="18"/>
+              </w:rPr>
+              <w:t xml:space="preserve">Restock form opens</w:t>
+            </w:r>
+          </w:p>
+        </w:tc>
+      </w:tr>
+      <w:tr>
+        <w:tc>
+          <w:tcPr>
+            <w:tcW w:type="dxa" w:w="500"/>
+            <w:tcBorders>
+              <w:top w:val="single" w:color="CCCCCC" w:sz="1"/>
+              <w:left w:val="single" w:color="CCCCCC" w:sz="1"/>
+              <w:bottom w:val="single" w:color="CCCCCC" w:sz="1"/>
+              <w:right w:val="single" w:color="CCCCCC" w:sz="1"/>
+            </w:tcBorders>
+            <w:shd w:fill="F2F2F2" w:val="clear"/>
+            <w:tcMar>
+              <w:top w:type="dxa" w:w="80"/>
+              <w:left w:type="dxa" w:w="140"/>
+              <w:bottom w:type="dxa" w:w="80"/>
+              <w:right w:type="dxa" w:w="140"/>
+            </w:tcMar>
+            <w:vAlign w:val="top"/>
+          </w:tcPr>
+          <w:p>
+            <w:r>
+              <w:rPr>
+                <w:rFonts w:ascii="Arial" w:cs="Arial" w:eastAsia="Arial" w:hAnsi="Arial"/>
+                <w:b/>
+                <w:bCs/>
+                <w:color w:val="000000"/>
+                <w:sz w:val="18"/>
+                <w:szCs w:val="18"/>
+              </w:rPr>
+              <w:t xml:space="preserve">3</w:t>
+            </w:r>
+          </w:p>
+        </w:tc>
+        <w:tc>
+          <w:tcPr>
+            <w:tcW w:type="dxa" w:w="1600"/>
+            <w:tcBorders>
+              <w:top w:val="single" w:color="CCCCCC" w:sz="1"/>
+              <w:left w:val="single" w:color="CCCCCC" w:sz="1"/>
+              <w:bottom w:val="single" w:color="CCCCCC" w:sz="1"/>
+              <w:right w:val="single" w:color="CCCCCC" w:sz="1"/>
+            </w:tcBorders>
+            <w:shd w:fill="D6E4F0" w:val="clear"/>
+            <w:tcMar>
+              <w:top w:type="dxa" w:w="80"/>
+              <w:left w:type="dxa" w:w="140"/>
+              <w:bottom w:type="dxa" w:w="80"/>
+              <w:right w:type="dxa" w:w="140"/>
+            </w:tcMar>
+            <w:vAlign w:val="top"/>
+          </w:tcPr>
+          <w:p>
+            <w:r>
+              <w:rPr>
+                <w:rFonts w:ascii="Arial" w:cs="Arial" w:eastAsia="Arial" w:hAnsi="Arial"/>
+                <w:b w:val="false"/>
+                <w:bCs w:val="false"/>
+                <w:color w:val="000000"/>
+                <w:sz w:val="18"/>
+                <w:szCs w:val="18"/>
+              </w:rPr>
+              <w:t xml:space="preserve">Front Desk</w:t>
+            </w:r>
+          </w:p>
+        </w:tc>
+        <w:tc>
+          <w:tcPr>
+            <w:tcW w:type="dxa" w:w="3600"/>
+            <w:tcBorders>
+              <w:top w:val="single" w:color="CCCCCC" w:sz="1"/>
+              <w:left w:val="single" w:color="CCCCCC" w:sz="1"/>
+              <w:bottom w:val="single" w:color="CCCCCC" w:sz="1"/>
+              <w:right w:val="single" w:color="CCCCCC" w:sz="1"/>
+            </w:tcBorders>
+            <w:shd w:fill="FFFFFF" w:val="clear"/>
+            <w:tcMar>
+              <w:top w:type="dxa" w:w="80"/>
+              <w:left w:type="dxa" w:w="140"/>
+              <w:bottom w:type="dxa" w:w="80"/>
+              <w:right w:type="dxa" w:w="140"/>
+            </w:tcMar>
+            <w:vAlign w:val="top"/>
+          </w:tcPr>
+          <w:p>
+            <w:r>
+              <w:rPr>
+                <w:rFonts w:ascii="Arial" w:cs="Arial" w:eastAsia="Arial" w:hAnsi="Arial"/>
+                <w:b w:val="false"/>
+                <w:bCs w:val="false"/>
+                <w:color w:val="000000"/>
+                <w:sz w:val="18"/>
+                <w:szCs w:val="18"/>
+              </w:rPr>
+              <w:t xml:space="preserve">Enters the number of units being added. Clicks 'Restock' to confirm.</w:t>
+            </w:r>
+          </w:p>
+        </w:tc>
+        <w:tc>
+          <w:tcPr>
+            <w:tcW w:type="dxa" w:w="3660"/>
+            <w:tcBorders>
+              <w:top w:val="single" w:color="CCCCCC" w:sz="1"/>
+              <w:left w:val="single" w:color="CCCCCC" w:sz="1"/>
+              <w:bottom w:val="single" w:color="CCCCCC" w:sz="1"/>
+              <w:right w:val="single" w:color="CCCCCC" w:sz="1"/>
+            </w:tcBorders>
+            <w:shd w:fill="E2EFDA" w:val="clear"/>
+            <w:tcMar>
+              <w:top w:type="dxa" w:w="80"/>
+              <w:left w:type="dxa" w:w="140"/>
+              <w:bottom w:type="dxa" w:w="80"/>
+              <w:right w:type="dxa" w:w="140"/>
+            </w:tcMar>
+            <w:vAlign w:val="top"/>
+          </w:tcPr>
+          <w:p>
+            <w:r>
+              <w:rPr>
+                <w:rFonts w:ascii="Arial" w:cs="Arial" w:eastAsia="Arial" w:hAnsi="Arial"/>
+                <w:b w:val="false"/>
+                <w:bCs w:val="false"/>
+                <w:color w:val="000000"/>
+                <w:sz w:val="18"/>
+                <w:szCs w:val="18"/>
+              </w:rPr>
+              <w:t xml:space="preserve">PATCH /api/shop/items/{id}/restock/ -- stock_quantity increased by the entered amount</w:t>
+            </w:r>
+          </w:p>
+        </w:tc>
+      </w:tr>
+      <w:tr>
+        <w:tc>
+          <w:tcPr>
+            <w:tcW w:type="dxa" w:w="500"/>
+            <w:tcBorders>
+              <w:top w:val="single" w:color="CCCCCC" w:sz="1"/>
+              <w:left w:val="single" w:color="CCCCCC" w:sz="1"/>
+              <w:bottom w:val="single" w:color="CCCCCC" w:sz="1"/>
+              <w:right w:val="single" w:color="CCCCCC" w:sz="1"/>
+            </w:tcBorders>
+            <w:shd w:fill="F2F2F2" w:val="clear"/>
+            <w:tcMar>
+              <w:top w:type="dxa" w:w="80"/>
+              <w:left w:type="dxa" w:w="140"/>
+              <w:bottom w:type="dxa" w:w="80"/>
+              <w:right w:type="dxa" w:w="140"/>
+            </w:tcMar>
+            <w:vAlign w:val="top"/>
+          </w:tcPr>
+          <w:p>
+            <w:r>
+              <w:rPr>
+                <w:rFonts w:ascii="Arial" w:cs="Arial" w:eastAsia="Arial" w:hAnsi="Arial"/>
+                <w:b/>
+                <w:bCs/>
+                <w:color w:val="000000"/>
+                <w:sz w:val="18"/>
+                <w:szCs w:val="18"/>
+              </w:rPr>
+              <w:t xml:space="preserve">4</w:t>
+            </w:r>
+          </w:p>
+        </w:tc>
+        <w:tc>
+          <w:tcPr>
+            <w:tcW w:type="dxa" w:w="1600"/>
+            <w:tcBorders>
+              <w:top w:val="single" w:color="CCCCCC" w:sz="1"/>
+              <w:left w:val="single" w:color="CCCCCC" w:sz="1"/>
+              <w:bottom w:val="single" w:color="CCCCCC" w:sz="1"/>
+              <w:right w:val="single" w:color="CCCCCC" w:sz="1"/>
+            </w:tcBorders>
+            <w:shd w:fill="D6E4F0" w:val="clear"/>
+            <w:tcMar>
+              <w:top w:type="dxa" w:w="80"/>
+              <w:left w:type="dxa" w:w="140"/>
+              <w:bottom w:type="dxa" w:w="80"/>
+              <w:right w:type="dxa" w:w="140"/>
+            </w:tcMar>
+            <w:vAlign w:val="top"/>
+          </w:tcPr>
+          <w:p>
+            <w:r>
+              <w:rPr>
+                <w:rFonts w:ascii="Arial" w:cs="Arial" w:eastAsia="Arial" w:hAnsi="Arial"/>
+                <w:b w:val="false"/>
+                <w:bCs w:val="false"/>
+                <w:color w:val="000000"/>
+                <w:sz w:val="18"/>
+                <w:szCs w:val="18"/>
+              </w:rPr>
+              <w:t xml:space="preserve">System</w:t>
+            </w:r>
+          </w:p>
+        </w:tc>
+        <w:tc>
+          <w:tcPr>
+            <w:tcW w:type="dxa" w:w="3600"/>
+            <w:tcBorders>
+              <w:top w:val="single" w:color="CCCCCC" w:sz="1"/>
+              <w:left w:val="single" w:color="CCCCCC" w:sz="1"/>
+              <w:bottom w:val="single" w:color="CCCCCC" w:sz="1"/>
+              <w:right w:val="single" w:color="CCCCCC" w:sz="1"/>
+            </w:tcBorders>
+            <w:shd w:fill="FFFFFF" w:val="clear"/>
+            <w:tcMar>
+              <w:top w:type="dxa" w:w="80"/>
+              <w:left w:type="dxa" w:w="140"/>
+              <w:bottom w:type="dxa" w:w="80"/>
+              <w:right w:type="dxa" w:w="140"/>
+            </w:tcMar>
+            <w:vAlign w:val="top"/>
+          </w:tcPr>
+          <w:p>
+            <w:r>
+              <w:rPr>
+                <w:rFonts w:ascii="Arial" w:cs="Arial" w:eastAsia="Arial" w:hAnsi="Arial"/>
+                <w:b w:val="false"/>
+                <w:bCs w:val="false"/>
+                <w:color w:val="000000"/>
+                <w:sz w:val="18"/>
+                <w:szCs w:val="18"/>
+              </w:rPr>
+              <w:t xml:space="preserve">—</w:t>
+            </w:r>
+          </w:p>
+        </w:tc>
+        <w:tc>
+          <w:tcPr>
+            <w:tcW w:type="dxa" w:w="3660"/>
+            <w:tcBorders>
+              <w:top w:val="single" w:color="CCCCCC" w:sz="1"/>
+              <w:left w:val="single" w:color="CCCCCC" w:sz="1"/>
+              <w:bottom w:val="single" w:color="CCCCCC" w:sz="1"/>
+              <w:right w:val="single" w:color="CCCCCC" w:sz="1"/>
+            </w:tcBorders>
+            <w:shd w:fill="E2EFDA" w:val="clear"/>
+            <w:tcMar>
+              <w:top w:type="dxa" w:w="80"/>
+              <w:left w:type="dxa" w:w="140"/>
+              <w:bottom w:type="dxa" w:w="80"/>
+              <w:right w:type="dxa" w:w="140"/>
+            </w:tcMar>
+            <w:vAlign w:val="top"/>
+          </w:tcPr>
+          <w:p>
+            <w:r>
+              <w:rPr>
+                <w:rFonts w:ascii="Arial" w:cs="Arial" w:eastAsia="Arial" w:hAnsi="Arial"/>
+                <w:b w:val="false"/>
+                <w:bCs w:val="false"/>
+                <w:color w:val="000000"/>
+                <w:sz w:val="18"/>
+                <w:szCs w:val="18"/>
+              </w:rPr>
+              <w:t xml:space="preserve">Product status returns to (or remains) In Stock. Updated count reflected immediately in the Inventory grid.</w:t>
+            </w:r>
+          </w:p>
+        </w:tc>
+      </w:tr>
+    </w:tbl>
+    <w:p>
+      <w:pPr>
+        <w:spacing w:after="80"/>
+      </w:pPr>
+    </w:p>
+    <w:p>
+      <w:pPr>
+        <w:spacing w:after="50" w:before="50"/>
+        <w:ind w:left="360"/>
+      </w:pPr>
+      <w:r>
+        <w:rPr>
+          <w:rFonts w:ascii="Arial" w:cs="Arial" w:eastAsia="Arial" w:hAnsi="Arial"/>
+          <w:color w:val="1F497D"/>
+          <w:sz w:val="18"/>
+          <w:szCs w:val="18"/>
+        </w:rPr>
+        <w:t xml:space="preserve">●  Restocking is available on any product at any time -- not gated behind an Out of Stock status.</w:t>
+      </w:r>
+    </w:p>
+    <w:p>
+      <w:pPr>
+        <w:spacing w:after="80"/>
+      </w:pPr>
+    </w:p>
+    <w:p>
+      <w:pPr>
+        <w:pBdr>
+          <w:bottom w:val="single" w:color="D9D9D9" w:sz="4"/>
+        </w:pBdr>
+        <w:spacing w:after="200" w:before="200"/>
+      </w:pPr>
+    </w:p>
+    <w:p>
+      <w:pPr>
+        <w:spacing w:after="100" w:before="320"/>
+      </w:pPr>
+      <w:r>
+        <w:rPr>
+          <w:rFonts w:ascii="Arial" w:cs="Arial" w:eastAsia="Arial" w:hAnsi="Arial"/>
+          <w:b/>
+          <w:bCs/>
+          <w:color w:val="1F497D"/>
+          <w:sz w:val="26"/>
+          <w:szCs w:val="26"/>
+        </w:rPr>
+        <w:t xml:space="preserve">4.4. Previewing a Product (Front Desk, Director, Ops Manager)</w:t>
+      </w:r>
+    </w:p>
+    <w:tbl>
+      <w:tblPr>
+        <w:tblW w:type="dxa" w:w="9360"/>
+        <w:tblBorders>
+          <w:top w:val="single" w:color="auto" w:sz="4"/>
+          <w:left w:val="single" w:color="auto" w:sz="4"/>
+          <w:bottom w:val="single" w:color="auto" w:sz="4"/>
+          <w:right w:val="single" w:color="auto" w:sz="4"/>
+          <w:insideH w:val="single" w:color="auto" w:sz="4"/>
+          <w:insideV w:val="single" w:color="auto" w:sz="4"/>
+        </w:tblBorders>
+      </w:tblPr>
+      <w:tblGrid>
+        <w:gridCol w:w="2200"/>
+        <w:gridCol w:w="7160"/>
+      </w:tblGrid>
+      <w:tr>
+        <w:tc>
+          <w:tcPr>
+            <w:tcW w:type="dxa" w:w="2200"/>
+            <w:tcBorders>
+              <w:top w:val="single" w:color="CCCCCC" w:sz="1"/>
+              <w:left w:val="single" w:color="CCCCCC" w:sz="1"/>
+              <w:bottom w:val="single" w:color="CCCCCC" w:sz="1"/>
+              <w:right w:val="single" w:color="CCCCCC" w:sz="1"/>
+            </w:tcBorders>
+            <w:shd w:fill="F2F2F2" w:val="clear"/>
+            <w:tcMar>
+              <w:top w:type="dxa" w:w="80"/>
+              <w:left w:type="dxa" w:w="140"/>
+              <w:bottom w:type="dxa" w:w="80"/>
+              <w:right w:type="dxa" w:w="140"/>
+            </w:tcMar>
+            <w:vAlign w:val="top"/>
+          </w:tcPr>
+          <w:p>
+            <w:r>
+              <w:rPr>
+                <w:rFonts w:ascii="Arial" w:cs="Arial" w:eastAsia="Arial" w:hAnsi="Arial"/>
+                <w:b/>
+                <w:bCs/>
+                <w:color w:val="000000"/>
+                <w:sz w:val="18"/>
+                <w:szCs w:val="18"/>
+              </w:rPr>
+              <w:t xml:space="preserve">Trigger</w:t>
+            </w:r>
+          </w:p>
+        </w:tc>
+        <w:tc>
+          <w:tcPr>
+            <w:tcW w:type="dxa" w:w="7160"/>
+            <w:tcBorders>
+              <w:top w:val="single" w:color="CCCCCC" w:sz="1"/>
+              <w:left w:val="single" w:color="CCCCCC" w:sz="1"/>
+              <w:bottom w:val="single" w:color="CCCCCC" w:sz="1"/>
+              <w:right w:val="single" w:color="CCCCCC" w:sz="1"/>
+            </w:tcBorders>
+            <w:shd w:fill="FFFFFF" w:val="clear"/>
+            <w:tcMar>
+              <w:top w:type="dxa" w:w="80"/>
+              <w:left w:type="dxa" w:w="140"/>
+              <w:bottom w:type="dxa" w:w="80"/>
+              <w:right w:type="dxa" w:w="140"/>
+            </w:tcMar>
+            <w:vAlign w:val="top"/>
+          </w:tcPr>
+          <w:p>
+            <w:r>
+              <w:rPr>
+                <w:rFonts w:ascii="Arial" w:cs="Arial" w:eastAsia="Arial" w:hAnsi="Arial"/>
+                <w:b w:val="false"/>
+                <w:bCs w:val="false"/>
+                <w:color w:val="000000"/>
+                <w:sz w:val="18"/>
+                <w:szCs w:val="18"/>
+              </w:rPr>
+              <w:t xml:space="preserve">Staff wants to inspect a product's full detail before acting on it</w:t>
+            </w:r>
+          </w:p>
+        </w:tc>
+      </w:tr>
+      <w:tr>
+        <w:tc>
+          <w:tcPr>
+            <w:tcW w:type="dxa" w:w="2200"/>
+            <w:tcBorders>
+              <w:top w:val="single" w:color="CCCCCC" w:sz="1"/>
+              <w:left w:val="single" w:color="CCCCCC" w:sz="1"/>
+              <w:bottom w:val="single" w:color="CCCCCC" w:sz="1"/>
+              <w:right w:val="single" w:color="CCCCCC" w:sz="1"/>
+            </w:tcBorders>
+            <w:shd w:fill="F2F2F2" w:val="clear"/>
+            <w:tcMar>
+              <w:top w:type="dxa" w:w="80"/>
+              <w:left w:type="dxa" w:w="140"/>
+              <w:bottom w:type="dxa" w:w="80"/>
+              <w:right w:type="dxa" w:w="140"/>
+            </w:tcMar>
+            <w:vAlign w:val="top"/>
+          </w:tcPr>
+          <w:p>
+            <w:r>
+              <w:rPr>
+                <w:rFonts w:ascii="Arial" w:cs="Arial" w:eastAsia="Arial" w:hAnsi="Arial"/>
+                <w:b/>
+                <w:bCs/>
+                <w:color w:val="000000"/>
+                <w:sz w:val="18"/>
+                <w:szCs w:val="18"/>
+              </w:rPr>
+              <w:t xml:space="preserve">Where</w:t>
+            </w:r>
+          </w:p>
+        </w:tc>
+        <w:tc>
+          <w:tcPr>
+            <w:tcW w:type="dxa" w:w="7160"/>
+            <w:tcBorders>
+              <w:top w:val="single" w:color="CCCCCC" w:sz="1"/>
+              <w:left w:val="single" w:color="CCCCCC" w:sz="1"/>
+              <w:bottom w:val="single" w:color="CCCCCC" w:sz="1"/>
+              <w:right w:val="single" w:color="CCCCCC" w:sz="1"/>
+            </w:tcBorders>
+            <w:shd w:fill="FFFFFF" w:val="clear"/>
+            <w:tcMar>
+              <w:top w:type="dxa" w:w="80"/>
+              <w:left w:type="dxa" w:w="140"/>
+              <w:bottom w:type="dxa" w:w="80"/>
+              <w:right w:type="dxa" w:w="140"/>
+            </w:tcMar>
+            <w:vAlign w:val="top"/>
+          </w:tcPr>
+          <w:p>
+            <w:r>
+              <w:rPr>
+                <w:rFonts w:ascii="Arial" w:cs="Arial" w:eastAsia="Arial" w:hAnsi="Arial"/>
+                <w:b w:val="false"/>
+                <w:bCs w:val="false"/>
+                <w:color w:val="000000"/>
+                <w:sz w:val="18"/>
+                <w:szCs w:val="18"/>
+              </w:rPr>
+              <w:t xml:space="preserve">Any item card in the Inventory tab or the cross-branch Catalogue tab</w:t>
+            </w:r>
+          </w:p>
+        </w:tc>
+      </w:tr>
+    </w:tbl>
+    <w:p>
+      <w:pPr>
+        <w:spacing w:after="80"/>
+      </w:pPr>
+    </w:p>
+    <w:p>
+      <w:pPr>
+        <w:spacing w:after="50" w:before="50"/>
+        <w:ind w:left="360"/>
+      </w:pPr>
+      <w:r>
+        <w:rPr>
+          <w:rFonts w:ascii="Arial" w:cs="Arial" w:eastAsia="Arial" w:hAnsi="Arial"/>
+          <w:color w:val="1F497D"/>
+          <w:sz w:val="18"/>
+          <w:szCs w:val="18"/>
+        </w:rPr>
+        <w:t xml:space="preserve">●  Preview shows: product images (click any image to view full-screen), SKU, branch, category, fixed sale price, description or set contents, and current stock status.</w:t>
+      </w:r>
+    </w:p>
+    <w:p>
+      <w:pPr>
+        <w:spacing w:after="50" w:before="50"/>
+        <w:ind w:left="360"/>
+      </w:pPr>
+      <w:r>
+        <w:rPr>
+          <w:rFonts w:ascii="Arial" w:cs="Arial" w:eastAsia="Arial" w:hAnsi="Arial"/>
+          <w:color w:val="1F497D"/>
+          <w:sz w:val="18"/>
+          <w:szCs w:val="18"/>
+        </w:rPr>
+        <w:t xml:space="preserve">●  The Sell item / Restock action button is available directly inside the preview -- staff can act without closing it first.</w:t>
+      </w:r>
+    </w:p>
+    <w:p>
+      <w:pPr>
+        <w:spacing w:after="50" w:before="50"/>
+        <w:ind w:left="360"/>
+      </w:pPr>
+      <w:r>
+        <w:rPr>
+          <w:rFonts w:ascii="Arial" w:cs="Arial" w:eastAsia="Arial" w:hAnsi="Arial"/>
+          <w:color w:val="1F497D"/>
+          <w:sz w:val="18"/>
+          <w:szCs w:val="18"/>
+        </w:rPr>
+        <w:t xml:space="preserve">●  Director and Ops Manager can preview products across all branches via the Catalogue tab; Front Desk is scoped to their own branch's Inventory tab.</w:t>
       </w:r>
     </w:p>
     <w:p>
@@ -21660,7 +23173,7 @@
           <w:sz w:val="22"/>
           <w:szCs w:val="22"/>
         </w:rPr>
-        <w:t xml:space="preserve">Showroom Item Status Lifecycle</w:t>
+        <w:t xml:space="preserve">Showroom Product Status Lifecycle (Quantity-Based)</w:t>
       </w:r>
     </w:p>
     <w:tbl>
@@ -21772,7 +23285,7 @@
                 <w:sz w:val="18"/>
                 <w:szCs w:val="18"/>
               </w:rPr>
-              <w:t xml:space="preserve">AVAILABLE</w:t>
+              <w:t xml:space="preserve">IN STOCK</w:t>
             </w:r>
           </w:p>
         </w:tc>
@@ -21804,7 +23317,7 @@
                 <w:sz w:val="18"/>
                 <w:szCs w:val="18"/>
               </w:rPr>
-              <w:t xml:space="preserve">Item is on the showroom floor; visible and sellable. Set on creation.</w:t>
+              <w:t xml:space="preserve">stock_quantity &gt; 0. Product is visible and sellable. Set whenever quantity is added (creation or restock).</w:t>
             </w:r>
           </w:p>
         </w:tc>
@@ -21838,7 +23351,7 @@
                 <w:sz w:val="18"/>
                 <w:szCs w:val="18"/>
               </w:rPr>
-              <w:t xml:space="preserve">SOLD</w:t>
+              <w:t xml:space="preserve">OUT OF STOCK</w:t>
             </w:r>
           </w:p>
         </w:tc>
@@ -21870,7 +23383,7 @@
                 <w:sz w:val="18"/>
                 <w:szCs w:val="18"/>
               </w:rPr>
-              <w:t xml:space="preserve">Item sold. Permanent record retained for revenue reporting. No further actions possible.</w:t>
+              <w:t xml:space="preserve">stock_quantity = 0, set automatically the moment a sale brings the count to zero. Product stays in the catalogue (searchable, previewable) but cannot be sold until restocked.</w:t>
             </w:r>
           </w:p>
         </w:tc>
@@ -21936,7 +23449,7 @@
                 <w:sz w:val="18"/>
                 <w:szCs w:val="18"/>
               </w:rPr>
-              <w:t xml:space="preserve">Not implemented. Items go directly AVAILABLE -&gt; SOLD. No hold or deposit flow.</w:t>
+              <w:t xml:space="preserve">Not implemented. No hold or deposit flow.</w:t>
             </w:r>
           </w:p>
         </w:tc>
@@ -22007,73 +23520,30 @@
           </w:p>
         </w:tc>
       </w:tr>
-      <w:tr>
-        <w:tc>
-          <w:tcPr>
-            <w:tcW w:type="dxa" w:w="2400"/>
-            <w:tcBorders>
-              <w:top w:val="single" w:color="CCCCCC" w:sz="1"/>
-              <w:left w:val="single" w:color="CCCCCC" w:sz="1"/>
-              <w:bottom w:val="single" w:color="CCCCCC" w:sz="1"/>
-              <w:right w:val="single" w:color="CCCCCC" w:sz="1"/>
-            </w:tcBorders>
-            <w:shd w:fill="FCE4D6" w:val="clear"/>
-            <w:tcMar>
-              <w:top w:type="dxa" w:w="80"/>
-              <w:left w:type="dxa" w:w="140"/>
-              <w:bottom w:type="dxa" w:w="80"/>
-              <w:right w:type="dxa" w:w="140"/>
-            </w:tcMar>
-            <w:vAlign w:val="top"/>
-          </w:tcPr>
-          <w:p>
-            <w:r>
-              <w:rPr>
-                <w:rFonts w:ascii="Arial" w:cs="Arial" w:eastAsia="Arial" w:hAnsi="Arial"/>
-                <w:b/>
-                <w:bCs/>
-                <w:color w:val="000000"/>
-                <w:sz w:val="18"/>
-                <w:szCs w:val="18"/>
-              </w:rPr>
-              <w:t xml:space="preserve">BROKEN_OUT -- REMOVED</w:t>
-            </w:r>
-          </w:p>
-        </w:tc>
-        <w:tc>
-          <w:tcPr>
-            <w:tcW w:type="dxa" w:w="6960"/>
-            <w:tcBorders>
-              <w:top w:val="single" w:color="CCCCCC" w:sz="1"/>
-              <w:left w:val="single" w:color="CCCCCC" w:sz="1"/>
-              <w:bottom w:val="single" w:color="CCCCCC" w:sz="1"/>
-              <w:right w:val="single" w:color="CCCCCC" w:sz="1"/>
-            </w:tcBorders>
-            <w:shd w:fill="FFFFFF" w:val="clear"/>
-            <w:tcMar>
-              <w:top w:type="dxa" w:w="80"/>
-              <w:left w:type="dxa" w:w="140"/>
-              <w:bottom w:type="dxa" w:w="80"/>
-              <w:right w:type="dxa" w:w="140"/>
-            </w:tcMar>
-            <w:vAlign w:val="top"/>
-          </w:tcPr>
-          <w:p>
-            <w:r>
-              <w:rPr>
-                <w:rFonts w:ascii="Arial" w:cs="Arial" w:eastAsia="Arial" w:hAnsi="Arial"/>
-                <w:b w:val="false"/>
-                <w:bCs w:val="false"/>
-                <w:color w:val="000000"/>
-                <w:sz w:val="18"/>
-                <w:szCs w:val="18"/>
-              </w:rPr>
-              <w:t xml:space="preserve">Not implemented.</w:t>
-            </w:r>
-          </w:p>
-        </w:tc>
-      </w:tr>
     </w:tbl>
+    <w:p>
+      <w:pPr>
+        <w:spacing w:after="80"/>
+      </w:pPr>
+    </w:p>
+    <w:p>
+      <w:pPr>
+        <w:shd w:fill="FFF2CC" w:val="clear"/>
+        <w:spacing w:after="80" w:before="80"/>
+        <w:ind w:left="200" w:right="200"/>
+      </w:pPr>
+      <w:r>
+        <w:rPr>
+          <w:rFonts w:ascii="Arial" w:cs="Arial" w:eastAsia="Arial" w:hAnsi="Arial"/>
+          <w:i/>
+          <w:iCs/>
+          <w:color w:val="5C4300"/>
+          <w:sz w:val="18"/>
+          <w:szCs w:val="18"/>
+        </w:rPr>
+        <w:t xml:space="preserve">  NOTE: Prior to v1.5, showroom items were tracked one-per-serial-number with an AVAILABLE -&gt; SOLD lifecycle. That model is replaced entirely by the quantity-based stock described in Part 4. Serial numbers remain relevant only to custom workshop orders, not showroom stock.</w:t>
+      </w:r>
+    </w:p>
     <w:p>
       <w:pPr>
         <w:spacing w:after="80"/>
@@ -24426,7 +25896,7 @@
           <w:sz w:val="16"/>
           <w:szCs w:val="16"/>
         </w:rPr>
-        <w:t xml:space="preserve">FMS Operations &amp; Process Flow Manual  |  SMS-FMS-2026-001  |  v1.4  |  July 2026  |  For internal use only</w:t>
+        <w:t xml:space="preserve">FMS Operations &amp; Process Flow Manual  |  SMS-FMS-2026-001  |  v1.5  |  July 2026  |  For internal use only</w:t>
       </w:r>
     </w:p>
     <w:sectPr>
@@ -24494,7 +25964,7 @@
         <w:sz w:val="16"/>
         <w:szCs w:val="16"/>
       </w:rPr>
-      <w:t xml:space="preserve">SMS-FMS-2026-001  |  Operations Flow Manual v1.4  |  Page </w:t>
+      <w:t xml:space="preserve">SMS-FMS-2026-001  |  Operations Flow Manual v1.5  |  Page </w:t>
     </w:r>
     <w:r>
       <w:rPr>

</xml_diff>